<commit_message>
Agregué dos párrafos y una referencia a mi estudio de bebidas azucaradas
</commit_message>
<xml_diff>
--- a/Protocolo_ScopingReview_GarbageCodes.docx
+++ b/Protocolo_ScopingReview_GarbageCodes.docx
@@ -33,6 +33,24 @@
         <w:t xml:space="preserve">2</w:t>
       </w:r>
       <w:r>
+        <w:t xml:space="preserve">, Siliezar-Portillo, Kevin</w:t>
+      </w:r>
+      <w:r>
+        <w:rPr>
+          <w:vertAlign w:val="superscript"/>
+        </w:rPr>
+        <w:t xml:space="preserve">2</w:t>
+      </w:r>
+      <w:r>
+        <w:t xml:space="preserve">, Rivas-Portillo, Alejandra</w:t>
+      </w:r>
+      <w:r>
+        <w:rPr>
+          <w:vertAlign w:val="superscript"/>
+        </w:rPr>
+        <w:t xml:space="preserve">2</w:t>
+      </w:r>
+      <w:r>
         <w:t xml:space="preserve">, Tejada-Peña, David</w:t>
       </w:r>
       <w:r>
@@ -48,7 +66,7 @@
         <w:rPr>
           <w:vertAlign w:val="superscript"/>
         </w:rPr>
-        <w:t xml:space="preserve">4</w:t>
+        <w:t xml:space="preserve">3</w:t>
       </w:r>
       <w:r>
         <w:t xml:space="preserve">, Gavidia-Leiva, César</w:t>
@@ -57,7 +75,7 @@
         <w:rPr>
           <w:vertAlign w:val="superscript"/>
         </w:rPr>
-        <w:t xml:space="preserve">5</w:t>
+        <w:t xml:space="preserve">3</w:t>
       </w:r>
       <w:r>
         <w:t xml:space="preserve">, Melendez-Gálvez, Mirna</w:t>
@@ -66,7 +84,7 @@
         <w:rPr>
           <w:vertAlign w:val="superscript"/>
         </w:rPr>
-        <w:t xml:space="preserve">6</w:t>
+        <w:t xml:space="preserve">3</w:t>
       </w:r>
     </w:p>
     <w:p>
@@ -94,7 +112,7 @@
         <w:t xml:space="preserve">2</w:t>
       </w:r>
       <w:r>
-        <w:t xml:space="preserve">Dr. José Matías Delgado’s University, El Salvador;</w:t>
+        <w:t xml:space="preserve">Dr. José Matías Delgado’s University. El Salvador;</w:t>
       </w:r>
     </w:p>
     <w:p>
@@ -105,7 +123,7 @@
         <w:rPr>
           <w:vertAlign w:val="superscript"/>
         </w:rPr>
-        <w:t xml:space="preserve">3,4,5,6</w:t>
+        <w:t xml:space="preserve">3</w:t>
       </w:r>
       <w:r>
         <w:t xml:space="preserve">National Health Institute, El Salvador. El Salvador.</w:t>
@@ -251,7 +269,7 @@
       <w:r>
         <w:t xml:space="preserve">Mortality statistics derived from Civil Registration and Vital Statistics systems form the bedrock of global epidemiological surveillance and public health planning</w:t>
       </w:r>
-      <w:hyperlink w:anchor="ref-setel2007">
+      <w:hyperlink w:anchor="ref-mathers2005">
         <w:r>
           <w:rPr>
             <w:rStyle w:val="Hyperlink"/>
@@ -266,7 +284,7 @@
         </w:rPr>
         <w:t xml:space="preserve">,</w:t>
       </w:r>
-      <w:hyperlink w:anchor="ref-mathers2005">
+      <w:hyperlink w:anchor="ref-setel2007">
         <w:r>
           <w:rPr>
             <w:rStyle w:val="Hyperlink"/>
@@ -276,7 +294,7 @@
         </w:r>
       </w:hyperlink>
       <w:r>
-        <w:t xml:space="preserve">. However, despite decades of global advocay, data quality progress remains sluggish, and the analytical utility of these databases is frequently undermined by persistent medical certification errors</w:t>
+        <w:t xml:space="preserve">. However, despite decades of global advocacy, data quality progress remains sluggish, and the analytical utility of these databases is frequently undermined by persistent medical certification errors</w:t>
       </w:r>
       <w:hyperlink w:anchor="ref-abouzahr2015">
         <w:r>
@@ -369,7 +387,7 @@
         </w:r>
       </w:hyperlink>
       <w:r>
-        <w:t xml:space="preserve">. Furthermore, because clinical interventions and medical training alone cannot fully eliminate these diagnostic errors at the source, robust post-hoc redistribution methods are methodologically indispensable [</w:t>
+        <w:t xml:space="preserve">. Furthermore, because clinical interventions and medical training alone cannot fully eliminate these diagnostic errors at the source</w:t>
       </w:r>
       <w:hyperlink w:anchor="ref-hart2020">
         <w:r>
@@ -381,28 +399,12 @@
         </w:r>
       </w:hyperlink>
       <w:r>
-        <w:t xml:space="preserve">;</w:t>
-      </w:r>
-      <w:hyperlink w:anchor="ref-mi">
-        <w:r>
-          <w:rPr>
-            <w:rStyle w:val="Hyperlink"/>
-            <w:b/>
-            <w:bCs/>
-            <w:vertAlign w:val="superscript"/>
-          </w:rPr>
-          <w:t xml:space="preserve">mi?</w:t>
-        </w:r>
-      </w:hyperlink>
-    </w:p>
-    <w:p>
-      <w:pPr>
-        <w:pStyle w:val="BodyText"/>
-      </w:pPr>
-      <w:r>
-        <w:t xml:space="preserve">To mitigate these systematic biases, a diverse array of correction methodologies has evolved over the past two decades</w:t>
-      </w:r>
-      <w:hyperlink w:anchor="ref-naghavi2010">
+        <w:rPr>
+          <w:vertAlign w:val="superscript"/>
+        </w:rPr>
+        <w:t xml:space="preserve">,</w:t>
+      </w:r>
+      <w:hyperlink w:anchor="ref-miki2018">
         <w:r>
           <w:rPr>
             <w:rStyle w:val="Hyperlink"/>
@@ -412,10 +414,22 @@
         </w:r>
       </w:hyperlink>
       <w:r>
+        <w:t xml:space="preserve">, robust post-hoc redistribution methods are methodologically indispensable</w:t>
+      </w:r>
+      <w:hyperlink w:anchor="ref-naghavi2020">
+        <w:r>
+          <w:rPr>
+            <w:rStyle w:val="Hyperlink"/>
+            <w:vertAlign w:val="superscript"/>
+          </w:rPr>
+          <w:t xml:space="preserve">6</w:t>
+        </w:r>
+      </w:hyperlink>
+      <w:r>
         <w:rPr>
           <w:vertAlign w:val="superscript"/>
         </w:rPr>
-        <w:t xml:space="preserve">–</w:t>
+        <w:t xml:space="preserve">,</w:t>
       </w:r>
       <w:hyperlink w:anchor="ref-foreman2016">
         <w:r>
@@ -423,13 +437,36 @@
             <w:rStyle w:val="Hyperlink"/>
             <w:vertAlign w:val="superscript"/>
           </w:rPr>
-          <w:t xml:space="preserve">17</w:t>
+          <w:t xml:space="preserve">14</w:t>
         </w:r>
       </w:hyperlink>
       <w:r>
-        <w:t xml:space="preserve">. Modern redistribution strategies are typically classified into four distinct mathematical approaches: multiple cause analysis, negative correlation, impairment reallocation, and proportional redistribution</w:t>
-      </w:r>
-      <w:hyperlink w:anchor="ref-johnson2021">
+        <w:t xml:space="preserve">.</w:t>
+      </w:r>
+    </w:p>
+    <w:p>
+      <w:pPr>
+        <w:pStyle w:val="BodyText"/>
+      </w:pPr>
+      <w:r>
+        <w:t xml:space="preserve">To mitigate these systematic biases, a diverse array of correction methodologies has evolved over the past two decades</w:t>
+      </w:r>
+      <w:hyperlink w:anchor="ref-foreman2016">
+        <w:r>
+          <w:rPr>
+            <w:rStyle w:val="Hyperlink"/>
+            <w:vertAlign w:val="superscript"/>
+          </w:rPr>
+          <w:t xml:space="preserve">14</w:t>
+        </w:r>
+      </w:hyperlink>
+      <w:r>
+        <w:rPr>
+          <w:vertAlign w:val="superscript"/>
+        </w:rPr>
+        <w:t xml:space="preserve">–</w:t>
+      </w:r>
+      <w:hyperlink w:anchor="ref-murray2008">
         <w:r>
           <w:rPr>
             <w:rStyle w:val="Hyperlink"/>
@@ -439,9 +476,9 @@
         </w:r>
       </w:hyperlink>
       <w:r>
-        <w:t xml:space="preserve">. Beyond these foundational methods, researchers have increasingly utilized individual-level multiple cause of death data to capture hidden etiologies</w:t>
-      </w:r>
-      <w:hyperlink w:anchor="ref-franca2014">
+        <w:t xml:space="preserve">. Modern redistribution strategies are typically classified into four distinct mathematical approaches: multiple cause analysis, negative correlation, impairment reallocation, and proportional redistribution</w:t>
+      </w:r>
+      <w:hyperlink w:anchor="ref-johnson2021">
         <w:r>
           <w:rPr>
             <w:rStyle w:val="Hyperlink"/>
@@ -451,24 +488,24 @@
         </w:r>
       </w:hyperlink>
       <w:r>
-        <w:rPr>
-          <w:vertAlign w:val="superscript"/>
-        </w:rPr>
-        <w:t xml:space="preserve">–</w:t>
-      </w:r>
-      <w:hyperlink w:anchor="ref-franca2019b">
+        <w:t xml:space="preserve">. Beyond these foundational methods, researchers have increasingly utilized individual-level multiple cause of death data to capture hidden etiologies</w:t>
+      </w:r>
+      <w:hyperlink w:anchor="ref-franca2014">
         <w:r>
           <w:rPr>
             <w:rStyle w:val="Hyperlink"/>
             <w:vertAlign w:val="superscript"/>
           </w:rPr>
-          <w:t xml:space="preserve">21</w:t>
+          <w:t xml:space="preserve">20</w:t>
         </w:r>
       </w:hyperlink>
       <w:r>
-        <w:t xml:space="preserve">. This led to the development of advanced computational techniques, including data linkage algorithms and coarsened exact matching</w:t>
-      </w:r>
-      <w:hyperlink w:anchor="ref-stevens2010">
+        <w:rPr>
+          <w:vertAlign w:val="superscript"/>
+        </w:rPr>
+        <w:t xml:space="preserve">–</w:t>
+      </w:r>
+      <w:hyperlink w:anchor="ref-franca2019b">
         <w:r>
           <w:rPr>
             <w:rStyle w:val="Hyperlink"/>
@@ -478,12 +515,733 @@
         </w:r>
       </w:hyperlink>
       <w:r>
+        <w:t xml:space="preserve">. This led to the development of advanced computational techniques, including data linkage algorithms and coarsened exact matching</w:t>
+      </w:r>
+      <w:hyperlink w:anchor="ref-stevens2010">
+        <w:r>
+          <w:rPr>
+            <w:rStyle w:val="Hyperlink"/>
+            <w:vertAlign w:val="superscript"/>
+          </w:rPr>
+          <w:t xml:space="preserve">23</w:t>
+        </w:r>
+      </w:hyperlink>
+      <w:r>
         <w:rPr>
           <w:vertAlign w:val="superscript"/>
         </w:rPr>
         <w:t xml:space="preserve">–</w:t>
       </w:r>
       <w:hyperlink w:anchor="ref-fihel2021">
+        <w:r>
+          <w:rPr>
+            <w:rStyle w:val="Hyperlink"/>
+            <w:vertAlign w:val="superscript"/>
+          </w:rPr>
+          <w:t xml:space="preserve">25</w:t>
+        </w:r>
+      </w:hyperlink>
+      <w:r>
+        <w:t xml:space="preserve">. Recent innovations also feature subnational regression models</w:t>
+      </w:r>
+      <w:hyperlink w:anchor="ref-grigoriev2024">
+        <w:r>
+          <w:rPr>
+            <w:rStyle w:val="Hyperlink"/>
+            <w:vertAlign w:val="superscript"/>
+          </w:rPr>
+          <w:t xml:space="preserve">26</w:t>
+        </w:r>
+      </w:hyperlink>
+      <w:r>
+        <w:rPr>
+          <w:vertAlign w:val="superscript"/>
+        </w:rPr>
+        <w:t xml:space="preserve">–</w:t>
+      </w:r>
+      <w:hyperlink w:anchor="ref-masquelier2019">
+        <w:r>
+          <w:rPr>
+            <w:rStyle w:val="Hyperlink"/>
+            <w:vertAlign w:val="superscript"/>
+          </w:rPr>
+          <w:t xml:space="preserve">28</w:t>
+        </w:r>
+      </w:hyperlink>
+      <w:r>
+        <w:t xml:space="preserve">, four-step probabilistic algorithms</w:t>
+      </w:r>
+      <w:hyperlink w:anchor="ref-scohy2025">
+        <w:r>
+          <w:rPr>
+            <w:rStyle w:val="Hyperlink"/>
+            <w:vertAlign w:val="superscript"/>
+          </w:rPr>
+          <w:t xml:space="preserve">29</w:t>
+        </w:r>
+      </w:hyperlink>
+      <w:r>
+        <w:t xml:space="preserve">, the application of pathophysiological redistribution packages</w:t>
+      </w:r>
+      <w:hyperlink w:anchor="ref-kyu2021">
+        <w:r>
+          <w:rPr>
+            <w:rStyle w:val="Hyperlink"/>
+            <w:vertAlign w:val="superscript"/>
+          </w:rPr>
+          <w:t xml:space="preserve">30</w:t>
+        </w:r>
+      </w:hyperlink>
+      <w:r>
+        <w:t xml:space="preserve">, and the integration of international rules with exact matching</w:t>
+      </w:r>
+      <w:hyperlink w:anchor="ref-zhang2025">
+        <w:r>
+          <w:rPr>
+            <w:rStyle w:val="Hyperlink"/>
+            <w:vertAlign w:val="superscript"/>
+          </w:rPr>
+          <w:t xml:space="preserve">31</w:t>
+        </w:r>
+      </w:hyperlink>
+      <w:r>
+        <w:t xml:space="preserve">. Moreover, cutting edge spatial and machine learning approaches have emerged, such as using spatial scan statistics and Local Moran’s I autocorrelation to adjust for spurious geographical clusters</w:t>
+      </w:r>
+      <w:hyperlink w:anchor="ref-teixeira2020">
+        <w:r>
+          <w:rPr>
+            <w:rStyle w:val="Hyperlink"/>
+            <w:vertAlign w:val="superscript"/>
+          </w:rPr>
+          <w:t xml:space="preserve">32</w:t>
+        </w:r>
+      </w:hyperlink>
+      <w:r>
+        <w:rPr>
+          <w:vertAlign w:val="superscript"/>
+        </w:rPr>
+        <w:t xml:space="preserve">,</w:t>
+      </w:r>
+      <w:hyperlink w:anchor="ref-dearaujo2026">
+        <w:r>
+          <w:rPr>
+            <w:rStyle w:val="Hyperlink"/>
+            <w:vertAlign w:val="superscript"/>
+          </w:rPr>
+          <w:t xml:space="preserve">33</w:t>
+        </w:r>
+      </w:hyperlink>
+      <w:r>
+        <w:t xml:space="preserve">, and deploying random forest algorithms or decision trees to map spatial inconsistencies and hierarchical clinical interactions</w:t>
+      </w:r>
+      <w:hyperlink w:anchor="ref-zimeomorais2023">
+        <w:r>
+          <w:rPr>
+            <w:rStyle w:val="Hyperlink"/>
+            <w:vertAlign w:val="superscript"/>
+          </w:rPr>
+          <w:t xml:space="preserve">34</w:t>
+        </w:r>
+      </w:hyperlink>
+      <w:r>
+        <w:rPr>
+          <w:vertAlign w:val="superscript"/>
+        </w:rPr>
+        <w:t xml:space="preserve">,</w:t>
+      </w:r>
+      <w:hyperlink w:anchor="ref-desouza2025">
+        <w:r>
+          <w:rPr>
+            <w:rStyle w:val="Hyperlink"/>
+            <w:vertAlign w:val="superscript"/>
+          </w:rPr>
+          <w:t xml:space="preserve">35</w:t>
+        </w:r>
+      </w:hyperlink>
+      <w:r>
+        <w:t xml:space="preserve">.</w:t>
+      </w:r>
+    </w:p>
+    <w:p>
+      <w:pPr>
+        <w:pStyle w:val="BodyText"/>
+      </w:pPr>
+      <w:r>
+        <w:t xml:space="preserve">Before applying these algorithms, baseline data quality is now objectively assessed using standardized metrics like the Vital Statistics Performance Index and automated diagnostic tools like ANACONDA</w:t>
+      </w:r>
+      <w:hyperlink w:anchor="ref-mikkelsen2015">
+        <w:r>
+          <w:rPr>
+            <w:rStyle w:val="Hyperlink"/>
+            <w:vertAlign w:val="superscript"/>
+          </w:rPr>
+          <w:t xml:space="preserve">36</w:t>
+        </w:r>
+      </w:hyperlink>
+      <w:r>
+        <w:rPr>
+          <w:vertAlign w:val="superscript"/>
+        </w:rPr>
+        <w:t xml:space="preserve">,</w:t>
+      </w:r>
+      <w:hyperlink w:anchor="ref-mikkelsen2020">
+        <w:r>
+          <w:rPr>
+            <w:rStyle w:val="Hyperlink"/>
+            <w:vertAlign w:val="superscript"/>
+          </w:rPr>
+          <w:t xml:space="preserve">37</w:t>
+        </w:r>
+      </w:hyperlink>
+      <w:r>
+        <w:t xml:space="preserve">. However, despite this methodological proliferation, current literature exhibits a critical translational gap</w:t>
+      </w:r>
+      <w:hyperlink w:anchor="ref-devleesschauwer2022">
+        <w:r>
+          <w:rPr>
+            <w:rStyle w:val="Hyperlink"/>
+            <w:vertAlign w:val="superscript"/>
+          </w:rPr>
+          <w:t xml:space="preserve">38</w:t>
+        </w:r>
+      </w:hyperlink>
+      <w:r>
+        <w:t xml:space="preserve">. Specifically, there is a lack of evidence evaluating how macro-level redistribution assumptions can be rigorously transfer to individual level simulation environments</w:t>
+      </w:r>
+      <w:hyperlink w:anchor="ref-ng2020">
+        <w:r>
+          <w:rPr>
+            <w:rStyle w:val="Hyperlink"/>
+            <w:vertAlign w:val="superscript"/>
+          </w:rPr>
+          <w:t xml:space="preserve">39</w:t>
+        </w:r>
+      </w:hyperlink>
+      <w:r>
+        <w:rPr>
+          <w:vertAlign w:val="superscript"/>
+        </w:rPr>
+        <w:t xml:space="preserve">,</w:t>
+      </w:r>
+      <w:hyperlink w:anchor="ref-chrysanthopoulou2021">
+        <w:r>
+          <w:rPr>
+            <w:rStyle w:val="Hyperlink"/>
+            <w:vertAlign w:val="superscript"/>
+          </w:rPr>
+          <w:t xml:space="preserve">40</w:t>
+        </w:r>
+      </w:hyperlink>
+      <w:r>
+        <w:t xml:space="preserve">. Unlike aggregated demographic models that rely on macroscopic trends, stochastic and agent-based microsimulations require highly disaggregated baseline mortality risks, as uncounted or misclassified deaths are rarely distributed randomly across populations</w:t>
+      </w:r>
+      <w:hyperlink w:anchor="ref-costa2020">
+        <w:r>
+          <w:rPr>
+            <w:rStyle w:val="Hyperlink"/>
+            <w:vertAlign w:val="superscript"/>
+          </w:rPr>
+          <w:t xml:space="preserve">41</w:t>
+        </w:r>
+      </w:hyperlink>
+      <w:r>
+        <w:t xml:space="preserve">. Naïve translation of macro-level proportions into microdata risks compounding structural errors. Consequently, this scoping review will map the current state of the art, evaluate the technical feasibility of these approaches within simulation environments, and establish a conceptual framework to guide future public health mathematical modeling</w:t>
+      </w:r>
+      <w:hyperlink w:anchor="ref-foreman2018">
+        <w:r>
+          <w:rPr>
+            <w:rStyle w:val="Hyperlink"/>
+            <w:vertAlign w:val="superscript"/>
+          </w:rPr>
+          <w:t xml:space="preserve">42</w:t>
+        </w:r>
+      </w:hyperlink>
+      <w:r>
+        <w:t xml:space="preserve">.</w:t>
+      </w:r>
+    </w:p>
+    <w:bookmarkStart w:id="20" w:name="research-questions"/>
+    <w:p>
+      <w:pPr>
+        <w:pStyle w:val="Heading2"/>
+      </w:pPr>
+      <w:r>
+        <w:rPr>
+          <w:rStyle w:val="SectionNumber"/>
+        </w:rPr>
+        <w:t xml:space="preserve">1.1</w:t>
+      </w:r>
+      <w:r>
+        <w:tab/>
+      </w:r>
+      <w:r>
+        <w:t xml:space="preserve">Research Questions</w:t>
+      </w:r>
+    </w:p>
+    <w:p>
+      <w:pPr>
+        <w:pStyle w:val="Compact"/>
+        <w:numPr>
+          <w:ilvl w:val="0"/>
+          <w:numId w:val="1001"/>
+        </w:numPr>
+      </w:pPr>
+      <w:r>
+        <w:t xml:space="preserve">What analytical methodologies (statistical, probabilistic, deterministic, linkage-based or machine learning) have been described in the literature for the correction and redistribution of</w:t>
+      </w:r>
+      <w:r>
+        <w:t xml:space="preserve"> </w:t>
+      </w:r>
+      <w:r>
+        <w:t xml:space="preserve">“garbage codes”</w:t>
+      </w:r>
+      <w:r>
+        <w:t xml:space="preserve"> </w:t>
+      </w:r>
+      <w:r>
+        <w:t xml:space="preserve">in mortality records?</w:t>
+      </w:r>
+    </w:p>
+    <w:p>
+      <w:pPr>
+        <w:pStyle w:val="Compact"/>
+        <w:numPr>
+          <w:ilvl w:val="0"/>
+          <w:numId w:val="1001"/>
+        </w:numPr>
+      </w:pPr>
+      <w:r>
+        <w:t xml:space="preserve">How are they classified and what types of</w:t>
+      </w:r>
+      <w:r>
+        <w:t xml:space="preserve"> </w:t>
+      </w:r>
+      <w:r>
+        <w:t xml:space="preserve">“garbage codes”</w:t>
+      </w:r>
+      <w:r>
+        <w:t xml:space="preserve"> </w:t>
+      </w:r>
+      <w:r>
+        <w:t xml:space="preserve">(poorly defined causes of ICD chapters, intermediate or terminal causes) are the main objective of each identified methodology?</w:t>
+      </w:r>
+    </w:p>
+    <w:p>
+      <w:pPr>
+        <w:pStyle w:val="Compact"/>
+        <w:numPr>
+          <w:ilvl w:val="0"/>
+          <w:numId w:val="1001"/>
+        </w:numPr>
+      </w:pPr>
+      <w:r>
+        <w:t xml:space="preserve">What is the documented level of applicability or compatibility of these correction methods to structure databases aimed at the development, calibration and validation of microsimulation models in health?</w:t>
+      </w:r>
+    </w:p>
+    <w:p>
+      <w:pPr>
+        <w:pStyle w:val="Compact"/>
+        <w:numPr>
+          <w:ilvl w:val="0"/>
+          <w:numId w:val="1001"/>
+        </w:numPr>
+      </w:pPr>
+      <w:r>
+        <w:t xml:space="preserve">What are the main methodological challenges, limitations and advantages reported when transferring or adapting analytical correction algorithms from the population (macro) level to the individual level (micro)?</w:t>
+      </w:r>
+    </w:p>
+    <w:bookmarkEnd w:id="20"/>
+    <w:bookmarkEnd w:id="21"/>
+    <w:bookmarkStart w:id="26" w:name="eligibility-criteria"/>
+    <w:p>
+      <w:pPr>
+        <w:pStyle w:val="Heading1"/>
+      </w:pPr>
+      <w:r>
+        <w:rPr>
+          <w:rStyle w:val="SectionNumber"/>
+        </w:rPr>
+        <w:t xml:space="preserve">2</w:t>
+      </w:r>
+      <w:r>
+        <w:tab/>
+      </w:r>
+      <w:r>
+        <w:t xml:space="preserve">ELIGIBILITY CRITERIA</w:t>
+      </w:r>
+    </w:p>
+    <w:bookmarkStart w:id="22" w:name="population"/>
+    <w:p>
+      <w:pPr>
+        <w:pStyle w:val="Heading2"/>
+      </w:pPr>
+      <w:r>
+        <w:rPr>
+          <w:rStyle w:val="SectionNumber"/>
+        </w:rPr>
+        <w:t xml:space="preserve">2.1</w:t>
+      </w:r>
+      <w:r>
+        <w:tab/>
+      </w:r>
+      <w:r>
+        <w:t xml:space="preserve">Population</w:t>
+      </w:r>
+    </w:p>
+    <w:p>
+      <w:pPr>
+        <w:pStyle w:val="FirstParagraph"/>
+      </w:pPr>
+      <w:r>
+        <w:t xml:space="preserve">This component defines eligible data records, populations, and geographic or demographic coverages.</w:t>
+      </w:r>
+    </w:p>
+    <w:p>
+      <w:pPr>
+        <w:pStyle w:val="Compact"/>
+        <w:numPr>
+          <w:ilvl w:val="0"/>
+          <w:numId w:val="1002"/>
+        </w:numPr>
+      </w:pPr>
+      <w:r>
+        <w:rPr>
+          <w:b/>
+          <w:bCs/>
+        </w:rPr>
+        <w:t xml:space="preserve">Inclusion Criteria:</w:t>
+      </w:r>
+    </w:p>
+    <w:p>
+      <w:pPr>
+        <w:pStyle w:val="Compact"/>
+        <w:numPr>
+          <w:ilvl w:val="1"/>
+          <w:numId w:val="1003"/>
+        </w:numPr>
+      </w:pPr>
+      <w:r>
+        <w:rPr>
+          <w:b/>
+          <w:bCs/>
+        </w:rPr>
+        <w:t xml:space="preserve">Data Type:</w:t>
+      </w:r>
+      <w:r>
+        <w:t xml:space="preserve"> </w:t>
+      </w:r>
+      <w:r>
+        <w:t xml:space="preserve">Studies utilizing population-based mortality databases, vital statistics systems, official national or subnational health statistics registers, or civil registration and vital statistics (CRVS) systems.</w:t>
+      </w:r>
+    </w:p>
+    <w:p>
+      <w:pPr>
+        <w:pStyle w:val="Compact"/>
+        <w:numPr>
+          <w:ilvl w:val="1"/>
+          <w:numId w:val="1003"/>
+        </w:numPr>
+      </w:pPr>
+      <w:r>
+        <w:rPr>
+          <w:b/>
+          <w:bCs/>
+        </w:rPr>
+        <w:t xml:space="preserve">Geography and Income Level:</w:t>
+      </w:r>
+      <w:r>
+        <w:t xml:space="preserve"> </w:t>
+      </w:r>
+      <w:r>
+        <w:t xml:space="preserve">Research focusing on populations within low- and middle-income countries (LMICs) as defined by historical or current World Bank classifications (e.g., regions within Latin America and the Caribbean, Sub-Saharan Africa, and South Asia).</w:t>
+      </w:r>
+    </w:p>
+    <w:p>
+      <w:pPr>
+        <w:pStyle w:val="Compact"/>
+        <w:numPr>
+          <w:ilvl w:val="1"/>
+          <w:numId w:val="1003"/>
+        </w:numPr>
+      </w:pPr>
+      <w:r>
+        <w:rPr>
+          <w:b/>
+          <w:bCs/>
+        </w:rPr>
+        <w:t xml:space="preserve">Technical Exception:</w:t>
+      </w:r>
+      <w:r>
+        <w:t xml:space="preserve"> </w:t>
+      </w:r>
+      <w:r>
+        <w:t xml:space="preserve">Global or multinational studies (e.g., Global Burden of Disease [GBD] analyses), provided they independently disaggregate methodologies and data applicable to LMIC geographies.</w:t>
+      </w:r>
+    </w:p>
+    <w:p>
+      <w:pPr>
+        <w:pStyle w:val="Compact"/>
+        <w:numPr>
+          <w:ilvl w:val="1"/>
+          <w:numId w:val="1003"/>
+        </w:numPr>
+      </w:pPr>
+      <w:r>
+        <w:rPr>
+          <w:b/>
+          <w:bCs/>
+        </w:rPr>
+        <w:t xml:space="preserve">Demography:</w:t>
+      </w:r>
+      <w:r>
+        <w:t xml:space="preserve"> </w:t>
+      </w:r>
+      <w:r>
+        <w:t xml:space="preserve">Records tracking general human mortality without restrictions on age groups (including neonatal, infant, adult, or geriatric mortality) or sex and gender.</w:t>
+      </w:r>
+    </w:p>
+    <w:p>
+      <w:pPr>
+        <w:pStyle w:val="Compact"/>
+        <w:numPr>
+          <w:ilvl w:val="0"/>
+          <w:numId w:val="1002"/>
+        </w:numPr>
+      </w:pPr>
+      <w:r>
+        <w:rPr>
+          <w:b/>
+          <w:bCs/>
+        </w:rPr>
+        <w:t xml:space="preserve">Exclusion Criteria:</w:t>
+      </w:r>
+    </w:p>
+    <w:p>
+      <w:pPr>
+        <w:pStyle w:val="Compact"/>
+        <w:numPr>
+          <w:ilvl w:val="1"/>
+          <w:numId w:val="1004"/>
+        </w:numPr>
+      </w:pPr>
+      <w:r>
+        <w:t xml:space="preserve">Clinical studies restricted to hyper-specific hospital specimens or controlled trials that do not utilize—or aim to correct—population-based records or broader epidemiological information systems.</w:t>
+      </w:r>
+    </w:p>
+    <w:bookmarkEnd w:id="22"/>
+    <w:bookmarkStart w:id="23" w:name="concept"/>
+    <w:p>
+      <w:pPr>
+        <w:pStyle w:val="Heading2"/>
+      </w:pPr>
+      <w:r>
+        <w:rPr>
+          <w:rStyle w:val="SectionNumber"/>
+        </w:rPr>
+        <w:t xml:space="preserve">2.2</w:t>
+      </w:r>
+      <w:r>
+        <w:tab/>
+      </w:r>
+      <w:r>
+        <w:t xml:space="preserve">Concept</w:t>
+      </w:r>
+    </w:p>
+    <w:p>
+      <w:pPr>
+        <w:pStyle w:val="FirstParagraph"/>
+      </w:pPr>
+      <w:r>
+        <w:t xml:space="preserve">This component delineates the core methodologies, algorithms, and analytical tools evaluated in this review.</w:t>
+      </w:r>
+    </w:p>
+    <w:p>
+      <w:pPr>
+        <w:pStyle w:val="Compact"/>
+        <w:numPr>
+          <w:ilvl w:val="0"/>
+          <w:numId w:val="1005"/>
+        </w:numPr>
+      </w:pPr>
+      <w:r>
+        <w:rPr>
+          <w:b/>
+          <w:bCs/>
+        </w:rPr>
+        <w:t xml:space="preserve">Inclusion Criteria:</w:t>
+      </w:r>
+    </w:p>
+    <w:p>
+      <w:pPr>
+        <w:pStyle w:val="Compact"/>
+        <w:numPr>
+          <w:ilvl w:val="1"/>
+          <w:numId w:val="1006"/>
+        </w:numPr>
+      </w:pPr>
+      <w:r>
+        <w:t xml:space="preserve">Studies describing, evaluating, validating, or implementing quantitative methods to identify, clean, reclassify, or redistribute</w:t>
+      </w:r>
+      <w:r>
+        <w:t xml:space="preserve"> </w:t>
+      </w:r>
+      <w:r>
+        <w:t xml:space="preserve">“garbage codes”</w:t>
+      </w:r>
+      <w:r>
+        <w:t xml:space="preserve"> </w:t>
+      </w:r>
+      <w:r>
+        <w:t xml:space="preserve">(levels 1 to 4) or ill-defined causes of death (as classified under ICD-10/ICD-11 Chapter XVIII, or ICD-9 equivalents).</w:t>
+      </w:r>
+    </w:p>
+    <w:p>
+      <w:pPr>
+        <w:pStyle w:val="Compact"/>
+        <w:numPr>
+          <w:ilvl w:val="1"/>
+          <w:numId w:val="1006"/>
+        </w:numPr>
+      </w:pPr>
+      <w:r>
+        <w:t xml:space="preserve">Methodologies within the following analytical categories are eligible:</w:t>
+      </w:r>
+    </w:p>
+    <w:p>
+      <w:pPr>
+        <w:pStyle w:val="Compact"/>
+        <w:numPr>
+          <w:ilvl w:val="2"/>
+          <w:numId w:val="1007"/>
+        </w:numPr>
+      </w:pPr>
+      <w:r>
+        <w:rPr>
+          <w:b/>
+          <w:bCs/>
+        </w:rPr>
+        <w:t xml:space="preserve">Traditional statistics and mathematical demography:</w:t>
+      </w:r>
+      <w:r>
+        <w:t xml:space="preserve"> </w:t>
+      </w:r>
+      <w:r>
+        <w:t xml:space="preserve">Proportional redistribution (simple or stratified by age and sex), fractional algorithms, and indirect demographic adjustment methods</w:t>
+      </w:r>
+      <w:hyperlink w:anchor="ref-naghavi2010">
+        <w:r>
+          <w:rPr>
+            <w:rStyle w:val="Hyperlink"/>
+            <w:vertAlign w:val="superscript"/>
+          </w:rPr>
+          <w:t xml:space="preserve">15</w:t>
+        </w:r>
+      </w:hyperlink>
+      <w:r>
+        <w:t xml:space="preserve">.</w:t>
+      </w:r>
+    </w:p>
+    <w:p>
+      <w:pPr>
+        <w:pStyle w:val="Compact"/>
+        <w:numPr>
+          <w:ilvl w:val="2"/>
+          <w:numId w:val="1007"/>
+        </w:numPr>
+      </w:pPr>
+      <w:r>
+        <w:rPr>
+          <w:b/>
+          <w:bCs/>
+        </w:rPr>
+        <w:t xml:space="preserve">Advanced statistical modeling:</w:t>
+      </w:r>
+      <w:r>
+        <w:t xml:space="preserve"> </w:t>
+      </w:r>
+      <w:r>
+        <w:t xml:space="preserve">Multiple imputation of missing or non-specific data, spatial or spatiotemporal regression modeling, and empirical or hierarchical Bayesian approaches (e.g., CODEm or CoDcorrect analytical algorithms)</w:t>
+      </w:r>
+      <w:hyperlink w:anchor="ref-foreman2016">
+        <w:r>
+          <w:rPr>
+            <w:rStyle w:val="Hyperlink"/>
+            <w:vertAlign w:val="superscript"/>
+          </w:rPr>
+          <w:t xml:space="preserve">14</w:t>
+        </w:r>
+      </w:hyperlink>
+      <w:r>
+        <w:rPr>
+          <w:vertAlign w:val="superscript"/>
+        </w:rPr>
+        <w:t xml:space="preserve">,</w:t>
+      </w:r>
+      <w:hyperlink w:anchor="ref-johnson2021">
+        <w:r>
+          <w:rPr>
+            <w:rStyle w:val="Hyperlink"/>
+            <w:vertAlign w:val="superscript"/>
+          </w:rPr>
+          <w:t xml:space="preserve">19</w:t>
+        </w:r>
+      </w:hyperlink>
+      <w:r>
+        <w:rPr>
+          <w:vertAlign w:val="superscript"/>
+        </w:rPr>
+        <w:t xml:space="preserve">,</w:t>
+      </w:r>
+      <w:hyperlink w:anchor="ref-grigoriev2024">
+        <w:r>
+          <w:rPr>
+            <w:rStyle w:val="Hyperlink"/>
+            <w:vertAlign w:val="superscript"/>
+          </w:rPr>
+          <w:t xml:space="preserve">26</w:t>
+        </w:r>
+      </w:hyperlink>
+      <w:r>
+        <w:t xml:space="preserve">.</w:t>
+      </w:r>
+    </w:p>
+    <w:p>
+      <w:pPr>
+        <w:pStyle w:val="Compact"/>
+        <w:numPr>
+          <w:ilvl w:val="2"/>
+          <w:numId w:val="1007"/>
+        </w:numPr>
+      </w:pPr>
+      <w:r>
+        <w:rPr>
+          <w:b/>
+          <w:bCs/>
+        </w:rPr>
+        <w:t xml:space="preserve">Data integration (record linkage):</w:t>
+      </w:r>
+      <w:r>
+        <w:t xml:space="preserve"> </w:t>
+      </w:r>
+      <w:r>
+        <w:t xml:space="preserve">Deterministic or probabilistic algorithms linking mortality records with complementary databases (e.g., hospital discharge records, automated verbal autopsies, or epidemiological surveillance systems)</w:t>
+      </w:r>
+      <w:hyperlink w:anchor="ref-franca2014">
+        <w:r>
+          <w:rPr>
+            <w:rStyle w:val="Hyperlink"/>
+            <w:vertAlign w:val="superscript"/>
+          </w:rPr>
+          <w:t xml:space="preserve">20</w:t>
+        </w:r>
+      </w:hyperlink>
+      <w:r>
+        <w:rPr>
+          <w:vertAlign w:val="superscript"/>
+        </w:rPr>
+        <w:t xml:space="preserve">,</w:t>
+      </w:r>
+      <w:hyperlink w:anchor="ref-bierrenbach2019">
         <w:r>
           <w:rPr>
             <w:rStyle w:val="Hyperlink"/>
@@ -493,366 +1251,15 @@
         </w:r>
       </w:hyperlink>
       <w:r>
-        <w:t xml:space="preserve">. Recent innovations also feature subnational regression models</w:t>
-      </w:r>
-      <w:hyperlink w:anchor="ref-grigoriev2024">
-        <w:r>
-          <w:rPr>
-            <w:rStyle w:val="Hyperlink"/>
-            <w:vertAlign w:val="superscript"/>
-          </w:rPr>
-          <w:t xml:space="preserve">25</w:t>
-        </w:r>
-      </w:hyperlink>
-      <w:r>
-        <w:rPr>
-          <w:vertAlign w:val="superscript"/>
-        </w:rPr>
-        <w:t xml:space="preserve">–</w:t>
-      </w:r>
-      <w:hyperlink w:anchor="ref-masquelier2019">
-        <w:r>
-          <w:rPr>
-            <w:rStyle w:val="Hyperlink"/>
-            <w:vertAlign w:val="superscript"/>
-          </w:rPr>
-          <w:t xml:space="preserve">27</w:t>
-        </w:r>
-      </w:hyperlink>
-      <w:r>
-        <w:t xml:space="preserve">, four-step probabilistic algorithms</w:t>
-      </w:r>
-      <w:hyperlink w:anchor="ref-scohy2025">
-        <w:r>
-          <w:rPr>
-            <w:rStyle w:val="Hyperlink"/>
-            <w:vertAlign w:val="superscript"/>
-          </w:rPr>
-          <w:t xml:space="preserve">28</w:t>
-        </w:r>
-      </w:hyperlink>
-      <w:r>
-        <w:t xml:space="preserve">, the application of pathophysiological redistribution packages</w:t>
-      </w:r>
-      <w:hyperlink w:anchor="ref-kyu2021">
-        <w:r>
-          <w:rPr>
-            <w:rStyle w:val="Hyperlink"/>
-            <w:vertAlign w:val="superscript"/>
-          </w:rPr>
-          <w:t xml:space="preserve">29</w:t>
-        </w:r>
-      </w:hyperlink>
-      <w:r>
-        <w:t xml:space="preserve">, and the integration of international rules with exact matching</w:t>
-      </w:r>
-      <w:hyperlink w:anchor="ref-zhang2025">
-        <w:r>
-          <w:rPr>
-            <w:rStyle w:val="Hyperlink"/>
-            <w:vertAlign w:val="superscript"/>
-          </w:rPr>
-          <w:t xml:space="preserve">30</w:t>
-        </w:r>
-      </w:hyperlink>
-      <w:r>
-        <w:t xml:space="preserve">. Moreover, cutting edge spatial and machine learning approaches have emerged, such as using spatial scan statistics and Local Moran’s I autocorrelation to adjust for spurious geographical clusters</w:t>
-      </w:r>
-      <w:hyperlink w:anchor="ref-teixeira2020">
-        <w:r>
-          <w:rPr>
-            <w:rStyle w:val="Hyperlink"/>
-            <w:vertAlign w:val="superscript"/>
-          </w:rPr>
-          <w:t xml:space="preserve">31</w:t>
-        </w:r>
-      </w:hyperlink>
-      <w:r>
-        <w:rPr>
-          <w:vertAlign w:val="superscript"/>
-        </w:rPr>
-        <w:t xml:space="preserve">,</w:t>
-      </w:r>
-      <w:hyperlink w:anchor="ref-dearaujo2026">
-        <w:r>
-          <w:rPr>
-            <w:rStyle w:val="Hyperlink"/>
-            <w:vertAlign w:val="superscript"/>
-          </w:rPr>
-          <w:t xml:space="preserve">32</w:t>
-        </w:r>
-      </w:hyperlink>
-      <w:r>
-        <w:t xml:space="preserve">, and deploying random forest algorithms or decision trees to map spatial inconsistencies and hierarchical clinical interactions</w:t>
-      </w:r>
-      <w:hyperlink w:anchor="ref-zimeomorais2023">
-        <w:r>
-          <w:rPr>
-            <w:rStyle w:val="Hyperlink"/>
-            <w:vertAlign w:val="superscript"/>
-          </w:rPr>
-          <w:t xml:space="preserve">33</w:t>
-        </w:r>
-      </w:hyperlink>
-      <w:r>
-        <w:rPr>
-          <w:vertAlign w:val="superscript"/>
-        </w:rPr>
-        <w:t xml:space="preserve">,</w:t>
-      </w:r>
-      <w:hyperlink w:anchor="ref-desouza2025">
-        <w:r>
-          <w:rPr>
-            <w:rStyle w:val="Hyperlink"/>
-            <w:vertAlign w:val="superscript"/>
-          </w:rPr>
-          <w:t xml:space="preserve">34</w:t>
-        </w:r>
-      </w:hyperlink>
-      <w:r>
         <w:t xml:space="preserve">.</w:t>
-      </w:r>
-    </w:p>
-    <w:p>
-      <w:pPr>
-        <w:pStyle w:val="BodyText"/>
-      </w:pPr>
-      <w:r>
-        <w:t xml:space="preserve">Before applying these algorithms, baseline data quality is now objectively assessed using standardized metrics like the Vital Statistics Performance Index and automated diagnostic tools like ANACONDA</w:t>
-      </w:r>
-      <w:hyperlink w:anchor="ref-mikkelsen2015">
-        <w:r>
-          <w:rPr>
-            <w:rStyle w:val="Hyperlink"/>
-            <w:vertAlign w:val="superscript"/>
-          </w:rPr>
-          <w:t xml:space="preserve">35</w:t>
-        </w:r>
-      </w:hyperlink>
-      <w:r>
-        <w:rPr>
-          <w:vertAlign w:val="superscript"/>
-        </w:rPr>
-        <w:t xml:space="preserve">,</w:t>
-      </w:r>
-      <w:hyperlink w:anchor="ref-mikkelsen2020">
-        <w:r>
-          <w:rPr>
-            <w:rStyle w:val="Hyperlink"/>
-            <w:vertAlign w:val="superscript"/>
-          </w:rPr>
-          <w:t xml:space="preserve">36</w:t>
-        </w:r>
-      </w:hyperlink>
-      <w:r>
-        <w:t xml:space="preserve">. However, despite this methodological proliferation, current literature exhibits a critical translational gap</w:t>
-      </w:r>
-      <w:hyperlink w:anchor="ref-devleesschauwer2022">
-        <w:r>
-          <w:rPr>
-            <w:rStyle w:val="Hyperlink"/>
-            <w:vertAlign w:val="superscript"/>
-          </w:rPr>
-          <w:t xml:space="preserve">37</w:t>
-        </w:r>
-      </w:hyperlink>
-      <w:r>
-        <w:t xml:space="preserve">. Specifically, there is a lack evidence synthesis evaluating how macro-level redistribution assumptions can be rigorously transfer to individual level simulation environments</w:t>
-      </w:r>
-      <w:hyperlink w:anchor="ref-ng2020">
-        <w:r>
-          <w:rPr>
-            <w:rStyle w:val="Hyperlink"/>
-            <w:vertAlign w:val="superscript"/>
-          </w:rPr>
-          <w:t xml:space="preserve">38</w:t>
-        </w:r>
-      </w:hyperlink>
-      <w:r>
-        <w:rPr>
-          <w:vertAlign w:val="superscript"/>
-        </w:rPr>
-        <w:t xml:space="preserve">,</w:t>
-      </w:r>
-      <w:hyperlink w:anchor="ref-chrysanthopoulou2021">
-        <w:r>
-          <w:rPr>
-            <w:rStyle w:val="Hyperlink"/>
-            <w:vertAlign w:val="superscript"/>
-          </w:rPr>
-          <w:t xml:space="preserve">39</w:t>
-        </w:r>
-      </w:hyperlink>
-      <w:r>
-        <w:t xml:space="preserve">. Unlike aggregated demographic models that rely on macroscopic trends, stocastic and agent-based microsimulations require highly disaggregated baseline mortality risks, as uncounted or misclassified deaths are rarely distributed randomly across populations</w:t>
-      </w:r>
-      <w:hyperlink w:anchor="ref-costa2020">
-        <w:r>
-          <w:rPr>
-            <w:rStyle w:val="Hyperlink"/>
-            <w:vertAlign w:val="superscript"/>
-          </w:rPr>
-          <w:t xml:space="preserve">40</w:t>
-        </w:r>
-      </w:hyperlink>
-      <w:r>
-        <w:t xml:space="preserve">. Naïve translation of macro-level proportions into microdata risks compounding structural errors. Consequently, this scoping review will map the current state of the art, evaluate the technical feasibility of these approaches within simulation environments, and establish a conceptual framework to guide future public health mathematical modeling</w:t>
-      </w:r>
-      <w:hyperlink w:anchor="ref-foreman2018">
-        <w:r>
-          <w:rPr>
-            <w:rStyle w:val="Hyperlink"/>
-            <w:vertAlign w:val="superscript"/>
-          </w:rPr>
-          <w:t xml:space="preserve">41</w:t>
-        </w:r>
-      </w:hyperlink>
-      <w:r>
-        <w:t xml:space="preserve">.</w:t>
-      </w:r>
-    </w:p>
-    <w:bookmarkStart w:id="20" w:name="research-questions"/>
-    <w:p>
-      <w:pPr>
-        <w:pStyle w:val="Heading2"/>
-      </w:pPr>
-      <w:r>
-        <w:rPr>
-          <w:rStyle w:val="SectionNumber"/>
-        </w:rPr>
-        <w:t xml:space="preserve">1.1</w:t>
-      </w:r>
-      <w:r>
-        <w:tab/>
-      </w:r>
-      <w:r>
-        <w:t xml:space="preserve">Research Questions</w:t>
       </w:r>
     </w:p>
     <w:p>
       <w:pPr>
         <w:pStyle w:val="Compact"/>
         <w:numPr>
-          <w:ilvl w:val="0"/>
-          <w:numId w:val="1001"/>
-        </w:numPr>
-      </w:pPr>
-      <w:r>
-        <w:t xml:space="preserve">What analytical methodologies (statistical, probabilistic, deterministic, linkage-based or machine learning) have been described in the literature for the correction and redistribution of</w:t>
-      </w:r>
-      <w:r>
-        <w:t xml:space="preserve"> </w:t>
-      </w:r>
-      <w:r>
-        <w:t xml:space="preserve">“garbage codes”</w:t>
-      </w:r>
-      <w:r>
-        <w:t xml:space="preserve"> </w:t>
-      </w:r>
-      <w:r>
-        <w:t xml:space="preserve">in mortality records?</w:t>
-      </w:r>
-    </w:p>
-    <w:p>
-      <w:pPr>
-        <w:pStyle w:val="Compact"/>
-        <w:numPr>
-          <w:ilvl w:val="0"/>
-          <w:numId w:val="1001"/>
-        </w:numPr>
-      </w:pPr>
-      <w:r>
-        <w:t xml:space="preserve">How are they classified and what types of</w:t>
-      </w:r>
-      <w:r>
-        <w:t xml:space="preserve"> </w:t>
-      </w:r>
-      <w:r>
-        <w:t xml:space="preserve">“garbage codes”</w:t>
-      </w:r>
-      <w:r>
-        <w:t xml:space="preserve"> </w:t>
-      </w:r>
-      <w:r>
-        <w:t xml:space="preserve">(poorly defined causes of ICD chapters, intermediate or terminal causes) are the main objective of each identified methodology?</w:t>
-      </w:r>
-    </w:p>
-    <w:p>
-      <w:pPr>
-        <w:pStyle w:val="Compact"/>
-        <w:numPr>
-          <w:ilvl w:val="0"/>
-          <w:numId w:val="1001"/>
-        </w:numPr>
-      </w:pPr>
-      <w:r>
-        <w:t xml:space="preserve">What is the documented level of applicability or compatibility of these correction methods to structure databases aimed at the development, calibration and validation of microsimulation models in health?</w:t>
-      </w:r>
-    </w:p>
-    <w:p>
-      <w:pPr>
-        <w:pStyle w:val="Compact"/>
-        <w:numPr>
-          <w:ilvl w:val="0"/>
-          <w:numId w:val="1001"/>
-        </w:numPr>
-      </w:pPr>
-      <w:r>
-        <w:t xml:space="preserve">What are the main methodological challenges, limitations and advantages reported when transferring or adapting analytical correction algorithms from the population (macro) level to the individual level (micro)?</w:t>
-      </w:r>
-    </w:p>
-    <w:bookmarkEnd w:id="20"/>
-    <w:bookmarkEnd w:id="21"/>
-    <w:bookmarkStart w:id="26" w:name="eligibility-criteria"/>
-    <w:p>
-      <w:pPr>
-        <w:pStyle w:val="Heading1"/>
-      </w:pPr>
-      <w:r>
-        <w:rPr>
-          <w:rStyle w:val="SectionNumber"/>
-        </w:rPr>
-        <w:t xml:space="preserve">2</w:t>
-      </w:r>
-      <w:r>
-        <w:tab/>
-      </w:r>
-      <w:r>
-        <w:t xml:space="preserve">ELIGIBILITY CRITERIA</w:t>
-      </w:r>
-    </w:p>
-    <w:bookmarkStart w:id="22" w:name="population"/>
-    <w:p>
-      <w:pPr>
-        <w:pStyle w:val="Heading2"/>
-      </w:pPr>
-      <w:r>
-        <w:rPr>
-          <w:rStyle w:val="SectionNumber"/>
-        </w:rPr>
-        <w:t xml:space="preserve">2.1</w:t>
-      </w:r>
-      <w:r>
-        <w:tab/>
-      </w:r>
-      <w:r>
-        <w:t xml:space="preserve">Population</w:t>
-      </w:r>
-    </w:p>
-    <w:p>
-      <w:pPr>
-        <w:pStyle w:val="FirstParagraph"/>
-      </w:pPr>
-      <w:r>
-        <w:t xml:space="preserve">This component defines eligible data records, populations, and geographic or demographic coverages.</w:t>
-      </w:r>
-    </w:p>
-    <w:p>
-      <w:pPr>
-        <w:pStyle w:val="Compact"/>
-        <w:numPr>
-          <w:ilvl w:val="0"/>
-          <w:numId w:val="1002"/>
+          <w:ilvl w:val="2"/>
+          <w:numId w:val="1007"/>
         </w:numPr>
       </w:pPr>
       <w:r>
@@ -860,150 +1267,13 @@
           <w:b/>
           <w:bCs/>
         </w:rPr>
-        <w:t xml:space="preserve">Inclusion Criteria:</w:t>
-      </w:r>
-    </w:p>
-    <w:p>
-      <w:pPr>
-        <w:pStyle w:val="Compact"/>
-        <w:numPr>
-          <w:ilvl w:val="1"/>
-          <w:numId w:val="1003"/>
-        </w:numPr>
-      </w:pPr>
-      <w:r>
-        <w:rPr>
-          <w:b/>
-          <w:bCs/>
-        </w:rPr>
-        <w:t xml:space="preserve">Data Type:</w:t>
-      </w:r>
-      <w:r>
-        <w:t xml:space="preserve"> </w:t>
-      </w:r>
-      <w:r>
-        <w:t xml:space="preserve">Studies utilizing population-based mortality databases, vital statistics systems, official national or subnational health statistics registers, or civil registration and vital statistics (CRVS) systems.</w:t>
-      </w:r>
-    </w:p>
-    <w:p>
-      <w:pPr>
-        <w:pStyle w:val="Compact"/>
-        <w:numPr>
-          <w:ilvl w:val="1"/>
-          <w:numId w:val="1003"/>
-        </w:numPr>
-      </w:pPr>
-      <w:r>
-        <w:rPr>
-          <w:b/>
-          <w:bCs/>
-        </w:rPr>
-        <w:t xml:space="preserve">Geography and Income Level:</w:t>
-      </w:r>
-      <w:r>
-        <w:t xml:space="preserve"> </w:t>
-      </w:r>
-      <w:r>
-        <w:t xml:space="preserve">Research focusing on populations within low- and middle-income countries (LMICs) as defined by historical or current World Bank classifications (e.g., regions within Latin America and the Caribbean, Sub-Saharan Africa, and South Asia).</w:t>
-      </w:r>
-    </w:p>
-    <w:p>
-      <w:pPr>
-        <w:pStyle w:val="Compact"/>
-        <w:numPr>
-          <w:ilvl w:val="1"/>
-          <w:numId w:val="1003"/>
-        </w:numPr>
-      </w:pPr>
-      <w:r>
-        <w:rPr>
-          <w:b/>
-          <w:bCs/>
-        </w:rPr>
-        <w:t xml:space="preserve">Technical Exception:</w:t>
-      </w:r>
-      <w:r>
-        <w:t xml:space="preserve"> </w:t>
-      </w:r>
-      <w:r>
-        <w:t xml:space="preserve">Global or multinational studies (e.g., Global Burden of Disease [GBD] analyses), provided they independently disaggregate methodologies and data applicable to LMIC geographies.</w:t>
-      </w:r>
-    </w:p>
-    <w:p>
-      <w:pPr>
-        <w:pStyle w:val="Compact"/>
-        <w:numPr>
-          <w:ilvl w:val="1"/>
-          <w:numId w:val="1003"/>
-        </w:numPr>
-      </w:pPr>
-      <w:r>
-        <w:rPr>
-          <w:b/>
-          <w:bCs/>
-        </w:rPr>
-        <w:t xml:space="preserve">Demography:</w:t>
-      </w:r>
-      <w:r>
-        <w:t xml:space="preserve"> </w:t>
-      </w:r>
-      <w:r>
-        <w:t xml:space="preserve">Records tracking general human mortality without restrictions on age groups (including neonatal, infant, adult, or geriatric mortality) or sex and gender.</w:t>
-      </w:r>
-    </w:p>
-    <w:p>
-      <w:pPr>
-        <w:pStyle w:val="Compact"/>
-        <w:numPr>
-          <w:ilvl w:val="0"/>
-          <w:numId w:val="1002"/>
-        </w:numPr>
-      </w:pPr>
-      <w:r>
-        <w:rPr>
-          <w:b/>
-          <w:bCs/>
-        </w:rPr>
-        <w:t xml:space="preserve">Exclusion Criteria:</w:t>
-      </w:r>
-    </w:p>
-    <w:p>
-      <w:pPr>
-        <w:pStyle w:val="Compact"/>
-        <w:numPr>
-          <w:ilvl w:val="1"/>
-          <w:numId w:val="1004"/>
-        </w:numPr>
-      </w:pPr>
-      <w:r>
-        <w:t xml:space="preserve">Clinical studies restricted to hyper-specific hospital specimens or controlled trials that do not utilize—or aim to correct—population-based records or broader epidemiological information systems.</w:t>
-      </w:r>
-    </w:p>
-    <w:bookmarkEnd w:id="22"/>
-    <w:bookmarkStart w:id="23" w:name="concept"/>
-    <w:p>
-      <w:pPr>
-        <w:pStyle w:val="Heading2"/>
-      </w:pPr>
-      <w:r>
-        <w:rPr>
-          <w:rStyle w:val="SectionNumber"/>
-        </w:rPr>
-        <w:t xml:space="preserve">2.2</w:t>
-      </w:r>
-      <w:r>
-        <w:tab/>
-      </w:r>
-      <w:r>
-        <w:t xml:space="preserve">Concept</w:t>
-      </w:r>
-    </w:p>
-    <w:p>
-      <w:pPr>
-        <w:pStyle w:val="FirstParagraph"/>
-      </w:pPr>
-      <w:r>
-        <w:t xml:space="preserve">This component delineates the core methodologies, algorithms, and analytical tools evaluated in this review.</w:t>
+        <w:t xml:space="preserve">Artificial intelligence and machine learning:</w:t>
+      </w:r>
+      <w:r>
+        <w:t xml:space="preserve"> </w:t>
+      </w:r>
+      <w:r>
+        <w:t xml:space="preserve">Data-driven predictive architectures (e.g., decision trees, gradient boosting, random forests, or other data-mining frameworks) applied to classify or predict underlying causes of death masked by non-specific codes.</w:t>
       </w:r>
     </w:p>
     <w:p>
@@ -1019,227 +1289,6 @@
           <w:b/>
           <w:bCs/>
         </w:rPr>
-        <w:t xml:space="preserve">Inclusion Criteria:</w:t>
-      </w:r>
-    </w:p>
-    <w:p>
-      <w:pPr>
-        <w:pStyle w:val="Compact"/>
-        <w:numPr>
-          <w:ilvl w:val="1"/>
-          <w:numId w:val="1006"/>
-        </w:numPr>
-      </w:pPr>
-      <w:r>
-        <w:t xml:space="preserve">Studies describing, evaluating, validating, or implementing quantitative methods to identify, clean, reclassify, or redistribute</w:t>
-      </w:r>
-      <w:r>
-        <w:t xml:space="preserve"> </w:t>
-      </w:r>
-      <w:r>
-        <w:t xml:space="preserve">“garbage codes”</w:t>
-      </w:r>
-      <w:r>
-        <w:t xml:space="preserve"> </w:t>
-      </w:r>
-      <w:r>
-        <w:t xml:space="preserve">(levels 1 to 4) or ill-defined causes of death (as classified under ICD-10/ICD-11 Chapter XVIII, or ICD-9 equivalents).</w:t>
-      </w:r>
-    </w:p>
-    <w:p>
-      <w:pPr>
-        <w:pStyle w:val="Compact"/>
-        <w:numPr>
-          <w:ilvl w:val="1"/>
-          <w:numId w:val="1006"/>
-        </w:numPr>
-      </w:pPr>
-      <w:r>
-        <w:t xml:space="preserve">Methodologies within the following analytical categories are eligible:</w:t>
-      </w:r>
-    </w:p>
-    <w:p>
-      <w:pPr>
-        <w:pStyle w:val="Compact"/>
-        <w:numPr>
-          <w:ilvl w:val="2"/>
-          <w:numId w:val="1007"/>
-        </w:numPr>
-      </w:pPr>
-      <w:r>
-        <w:rPr>
-          <w:b/>
-          <w:bCs/>
-        </w:rPr>
-        <w:t xml:space="preserve">Traditional statistics and mathematical demography:</w:t>
-      </w:r>
-      <w:r>
-        <w:t xml:space="preserve"> </w:t>
-      </w:r>
-      <w:r>
-        <w:t xml:space="preserve">Proportional redistribution (simple or stratified by age and sex), fractional algorithms, and indirect demographic adjustment methods</w:t>
-      </w:r>
-      <w:hyperlink w:anchor="ref-naghavi2010">
-        <w:r>
-          <w:rPr>
-            <w:rStyle w:val="Hyperlink"/>
-            <w:vertAlign w:val="superscript"/>
-          </w:rPr>
-          <w:t xml:space="preserve">13</w:t>
-        </w:r>
-      </w:hyperlink>
-      <w:r>
-        <w:t xml:space="preserve">.</w:t>
-      </w:r>
-    </w:p>
-    <w:p>
-      <w:pPr>
-        <w:pStyle w:val="Compact"/>
-        <w:numPr>
-          <w:ilvl w:val="2"/>
-          <w:numId w:val="1007"/>
-        </w:numPr>
-      </w:pPr>
-      <w:r>
-        <w:rPr>
-          <w:b/>
-          <w:bCs/>
-        </w:rPr>
-        <w:t xml:space="preserve">Advanced statistical modeling:</w:t>
-      </w:r>
-      <w:r>
-        <w:t xml:space="preserve"> </w:t>
-      </w:r>
-      <w:r>
-        <w:t xml:space="preserve">Multiple imputation of missing or non-specific data, spatial or spatiotemporal regression modeling, and empirical or hierarchical Bayesian approaches (e.g., CODEm or CoDcorrect analytical algorithms)</w:t>
-      </w:r>
-      <w:hyperlink w:anchor="ref-foreman2016">
-        <w:r>
-          <w:rPr>
-            <w:rStyle w:val="Hyperlink"/>
-            <w:vertAlign w:val="superscript"/>
-          </w:rPr>
-          <w:t xml:space="preserve">17</w:t>
-        </w:r>
-      </w:hyperlink>
-      <w:r>
-        <w:rPr>
-          <w:vertAlign w:val="superscript"/>
-        </w:rPr>
-        <w:t xml:space="preserve">,</w:t>
-      </w:r>
-      <w:hyperlink w:anchor="ref-johnson2021">
-        <w:r>
-          <w:rPr>
-            <w:rStyle w:val="Hyperlink"/>
-            <w:vertAlign w:val="superscript"/>
-          </w:rPr>
-          <w:t xml:space="preserve">18</w:t>
-        </w:r>
-      </w:hyperlink>
-      <w:r>
-        <w:rPr>
-          <w:vertAlign w:val="superscript"/>
-        </w:rPr>
-        <w:t xml:space="preserve">,</w:t>
-      </w:r>
-      <w:hyperlink w:anchor="ref-grigoriev2024">
-        <w:r>
-          <w:rPr>
-            <w:rStyle w:val="Hyperlink"/>
-            <w:vertAlign w:val="superscript"/>
-          </w:rPr>
-          <w:t xml:space="preserve">25</w:t>
-        </w:r>
-      </w:hyperlink>
-      <w:r>
-        <w:t xml:space="preserve">.</w:t>
-      </w:r>
-    </w:p>
-    <w:p>
-      <w:pPr>
-        <w:pStyle w:val="Compact"/>
-        <w:numPr>
-          <w:ilvl w:val="2"/>
-          <w:numId w:val="1007"/>
-        </w:numPr>
-      </w:pPr>
-      <w:r>
-        <w:rPr>
-          <w:b/>
-          <w:bCs/>
-        </w:rPr>
-        <w:t xml:space="preserve">Data integration (record linkage):</w:t>
-      </w:r>
-      <w:r>
-        <w:t xml:space="preserve"> </w:t>
-      </w:r>
-      <w:r>
-        <w:t xml:space="preserve">Deterministic or probabilistic algorithms linking mortality records with complementary databases (e.g., hospital discharge records, automated verbal autopsies, or epidemiological surveillance systems)</w:t>
-      </w:r>
-      <w:hyperlink w:anchor="ref-franca2014">
-        <w:r>
-          <w:rPr>
-            <w:rStyle w:val="Hyperlink"/>
-            <w:vertAlign w:val="superscript"/>
-          </w:rPr>
-          <w:t xml:space="preserve">19</w:t>
-        </w:r>
-      </w:hyperlink>
-      <w:r>
-        <w:rPr>
-          <w:vertAlign w:val="superscript"/>
-        </w:rPr>
-        <w:t xml:space="preserve">,</w:t>
-      </w:r>
-      <w:hyperlink w:anchor="ref-bierrenbach2019">
-        <w:r>
-          <w:rPr>
-            <w:rStyle w:val="Hyperlink"/>
-            <w:vertAlign w:val="superscript"/>
-          </w:rPr>
-          <w:t xml:space="preserve">23</w:t>
-        </w:r>
-      </w:hyperlink>
-      <w:r>
-        <w:t xml:space="preserve">.</w:t>
-      </w:r>
-    </w:p>
-    <w:p>
-      <w:pPr>
-        <w:pStyle w:val="Compact"/>
-        <w:numPr>
-          <w:ilvl w:val="2"/>
-          <w:numId w:val="1007"/>
-        </w:numPr>
-      </w:pPr>
-      <w:r>
-        <w:rPr>
-          <w:b/>
-          <w:bCs/>
-        </w:rPr>
-        <w:t xml:space="preserve">Artificial intelligence and machine learning:</w:t>
-      </w:r>
-      <w:r>
-        <w:t xml:space="preserve"> </w:t>
-      </w:r>
-      <w:r>
-        <w:t xml:space="preserve">Data-driven predictive architectures (e.g., decision trees, gradient boosting, random forests, or other data-mining frameworks) applied to classify or predict underlying causes of death masked by non-specific codes.</w:t>
-      </w:r>
-    </w:p>
-    <w:p>
-      <w:pPr>
-        <w:pStyle w:val="Compact"/>
-        <w:numPr>
-          <w:ilvl w:val="0"/>
-          <w:numId w:val="1005"/>
-        </w:numPr>
-      </w:pPr>
-      <w:r>
-        <w:rPr>
-          <w:b/>
-          <w:bCs/>
-        </w:rPr>
         <w:t xml:space="preserve">Exclusion Criteria:</w:t>
       </w:r>
     </w:p>
@@ -1594,7 +1643,7 @@
         <w:t xml:space="preserve"> </w:t>
       </w:r>
       <w:r>
-        <w:t xml:space="preserve">An initial search of MEDLINE (Ovid) will be undertaken to analyze text words in titles and abstracts, Medical Subject Headings (MeSH), and author-supplied keywords from relevant articles.</w:t>
+        <w:t xml:space="preserve">An initial search of MEDLINE (Pubmed) will be undertaken to analyze text words in titles and abstracts, Medical Subject Headings (MeSH), and author-supplied keywords from relevant articles.</w:t>
       </w:r>
     </w:p>
     <w:p>
@@ -1616,7 +1665,7 @@
         <w:t xml:space="preserve"> </w:t>
       </w:r>
       <w:r>
-        <w:t xml:space="preserve">A comprehensive search strategy will be developed using these identified terms, then translated and adapted for Scopus, Web of Science, LILACS, and SciELO. The complete search syntax for MEDLINE (Ovid) is presented in Appendix I.</w:t>
+        <w:t xml:space="preserve">A comprehensive search strategy will be developed using these identified terms, then translated and adapted for Scopus, Web of Science, LILACS, and SciELO. The complete search syntax for MEDLINE (Pubmed) is presented in Appendix I.</w:t>
       </w:r>
     </w:p>
     <w:p>
@@ -1660,7 +1709,7 @@
         <w:t xml:space="preserve"> </w:t>
       </w:r>
       <w:r>
-        <w:t xml:space="preserve">To locate technical reports and eligible grey literature, a targeted list of national and international health organization websites will be compiled following the two-step Google search methodology.</w:t>
+        <w:t xml:space="preserve">To capture unindexed institutional reports, technical documents, and policy papers while ensuring full methodological transparency, grey literature retrieval will follow the JBI guidelines for evidence syntheses.</w:t>
       </w:r>
     </w:p>
     <w:p>
@@ -1672,35 +1721,7 @@
         </w:numPr>
       </w:pPr>
       <w:r>
-        <w:rPr>
-          <w:b/>
-          <w:bCs/>
-        </w:rPr>
-        <w:t xml:space="preserve">Preliminary Term Identification:</w:t>
-      </w:r>
-      <w:r>
-        <w:t xml:space="preserve"> </w:t>
-      </w:r>
-      <w:r>
-        <w:t xml:space="preserve">A preliminary Google search will be conducted to identify key text words, accounting for highly variable terminology such as</w:t>
-      </w:r>
-      <w:r>
-        <w:t xml:space="preserve"> </w:t>
-      </w:r>
-      <w:r>
-        <w:t xml:space="preserve">“unspecific causes”</w:t>
-      </w:r>
-      <w:r>
-        <w:t xml:space="preserve"> </w:t>
-      </w:r>
-      <w:r>
-        <w:t xml:space="preserve">or</w:t>
-      </w:r>
-      <w:r>
-        <w:t xml:space="preserve"> </w:t>
-      </w:r>
-      <w:r>
-        <w:t xml:space="preserve">“ambiguous causes.”</w:t>
+        <w:t xml:space="preserve">The search will encompass targeted repository exploration of key international and regional health authorities—specifically the World Health Organization (WHO), the Pan American Health Organization (PAHO), the Institute for Health Metrics and Evaluation (IHME), and the Ministry of Health of El Salvador (MINSAL).</w:t>
       </w:r>
     </w:p>
     <w:p>
@@ -1712,25 +1733,31 @@
         </w:numPr>
       </w:pPr>
       <w:r>
-        <w:rPr>
-          <w:b/>
-          <w:bCs/>
-        </w:rPr>
-        <w:t xml:space="preserve">Structured Execution:</w:t>
-      </w:r>
-      <w:r>
-        <w:t xml:space="preserve"> </w:t>
-      </w:r>
-      <w:r>
-        <w:t xml:space="preserve">Ten unique structured Google searches will be executed using distinct keyword combinations representing the population, concept, and context (PCC) of interest.</w:t>
-      </w:r>
-    </w:p>
-    <w:p>
-      <w:pPr>
-        <w:pStyle w:val="FirstParagraph"/>
-      </w:pPr>
-      <w:r>
-        <w:t xml:space="preserve">The first 100 results of each structured search will be screened. Identified organizational websites will be manually evaluated for technical reports. Finally, vital registration epidemiologists, public health officials, and key collaborators with expertise in health information systems within LMICs will be consulted to identify any additional missing sources.</w:t>
+        <w:t xml:space="preserve">Specialized grey literature databases (e.g., CADTH GreyMatters, BASE, and OpenGrey) will be interrogated. For open web searches conducted via Google Scholar, bulk record management will be systematized using the</w:t>
+      </w:r>
+      <w:r>
+        <w:t xml:space="preserve"> </w:t>
+      </w:r>
+      <w:r>
+        <w:t xml:space="preserve">‘Publish or Perish’</w:t>
+      </w:r>
+      <w:r>
+        <w:t xml:space="preserve"> </w:t>
+      </w:r>
+      <w:r>
+        <w:t xml:space="preserve">software.</w:t>
+      </w:r>
+    </w:p>
+    <w:p>
+      <w:pPr>
+        <w:pStyle w:val="Compact"/>
+        <w:numPr>
+          <w:ilvl w:val="1"/>
+          <w:numId w:val="1015"/>
+        </w:numPr>
+      </w:pPr>
+      <w:r>
+        <w:t xml:space="preserve">In strict adherence to PRISMA-S standards, every targeted website check, exact search string, date of execution, and precise hit count will be systematically logged in an audit tracking table (Appendix III) to guarantee complete auditability and reproducibility.</w:t>
       </w:r>
     </w:p>
     <w:bookmarkEnd w:id="27"/>
@@ -1757,7 +1784,15 @@
         <w:pStyle w:val="FirstParagraph"/>
       </w:pPr>
       <w:r>
-        <w:t xml:space="preserve">To ensure the methodological reproducibility and transparency required by the PRISMA-ScR guidelines, the information retrieval process will be systematized within the R statistical environment (v4.5 or higher). The</w:t>
+        <w:t xml:space="preserve">To ensure the methodological reproducibility and transparency required by the PRISMA-ScR guidelines, this scoping review protocol was registered a priori on the Open Science Framework (OSF) [10.17605/OSF.IO/ZP9AQ]. The review is reported in accordance with the Preferred Reporting Items for Systematic reviews and Meta-Analyses extension for Scoping Reviews (PRISMA-ScR) checklist (see Supplementary File 1)</w:t>
+      </w:r>
+    </w:p>
+    <w:p>
+      <w:pPr>
+        <w:pStyle w:val="BodyText"/>
+      </w:pPr>
+      <w:r>
+        <w:t xml:space="preserve">Furthermore, the information retrieval process will be systematized within the R statistical environment (v4.5 or higher). The</w:t>
       </w:r>
       <w:r>
         <w:t xml:space="preserve"> </w:t>
@@ -1817,7 +1852,7 @@
         <w:t xml:space="preserve"> </w:t>
       </w:r>
       <w:r>
-        <w:t xml:space="preserve">package using fuzzy string-matching models, supplemented by manual verification of borderline cases. Finally, title and abstract screening will be conducted through the interactive graphical interface of the</w:t>
+        <w:t xml:space="preserve">package using fuzzy string-matching models, supplemented by manual verification of borderline cases. Finally, title and abstract screening will be conducted using the</w:t>
       </w:r>
       <w:r>
         <w:t xml:space="preserve"> </w:t>
@@ -1832,7 +1867,15 @@
         <w:t xml:space="preserve"> </w:t>
       </w:r>
       <w:r>
-        <w:t xml:space="preserve">package, supported by Latent Dirichlet Allocation (LDA) algorithms for topic modeling to optimize evidence selection in accordance with the PCC framework.</w:t>
+        <w:t xml:space="preserve">package, supplemented by Latent Dirichlet Allocation (LDA) topic modeling strictly as a computational decision-support tool to assist with thematic clustering and reduce reviewer fatigue. To eliminate any risk of algorithmic bias, every single inclusion and exclusion decision is made independently by two human reviewers, with all discrepancies resolved through consensus or third-party arbitration in strict adherence to the PCC framework.</w:t>
+      </w:r>
+    </w:p>
+    <w:p>
+      <w:pPr>
+        <w:pStyle w:val="BodyText"/>
+      </w:pPr>
+      <w:r>
+        <w:t xml:space="preserve">The final literature search will be re-run immediately prior to submission. Any methodological deviations from this registered protocol will be fully documented and reported in the final publication.</w:t>
       </w:r>
     </w:p>
     <w:bookmarkEnd w:id="28"/>
@@ -1942,7 +1985,7 @@
             <w:rStyle w:val="Hyperlink"/>
             <w:vertAlign w:val="superscript"/>
           </w:rPr>
-          <w:t xml:space="preserve">18</w:t>
+          <w:t xml:space="preserve">19</w:t>
         </w:r>
       </w:hyperlink>
       <w:r>
@@ -1954,7 +1997,7 @@
             <w:rStyle w:val="Hyperlink"/>
             <w:vertAlign w:val="superscript"/>
           </w:rPr>
-          <w:t xml:space="preserve">33</w:t>
+          <w:t xml:space="preserve">34</w:t>
         </w:r>
       </w:hyperlink>
       <w:r>
@@ -2013,7 +2056,7 @@
             <w:rStyle w:val="Hyperlink"/>
             <w:vertAlign w:val="superscript"/>
           </w:rPr>
-          <w:t xml:space="preserve">18</w:t>
+          <w:t xml:space="preserve">19</w:t>
         </w:r>
       </w:hyperlink>
       <w:r>
@@ -2041,39 +2084,6 @@
         <w:t xml:space="preserve">The type of redistribution model used, the algorithmic and software ecosystems utilized, and the specific performance metrics reported to demonstrate data quality improvement</w:t>
       </w:r>
       <w:hyperlink w:anchor="ref-ng2020">
-        <w:r>
-          <w:rPr>
-            <w:rStyle w:val="Hyperlink"/>
-            <w:vertAlign w:val="superscript"/>
-          </w:rPr>
-          <w:t xml:space="preserve">38</w:t>
-        </w:r>
-      </w:hyperlink>
-      <w:r>
-        <w:t xml:space="preserve">.</w:t>
-      </w:r>
-    </w:p>
-    <w:p>
-      <w:pPr>
-        <w:numPr>
-          <w:ilvl w:val="0"/>
-          <w:numId w:val="1016"/>
-        </w:numPr>
-      </w:pPr>
-      <w:r>
-        <w:rPr>
-          <w:b/>
-          <w:bCs/>
-        </w:rPr>
-        <w:t xml:space="preserve">Microsimulation applicability:</w:t>
-      </w:r>
-      <w:r>
-        <w:t xml:space="preserve"> </w:t>
-      </w:r>
-      <w:r>
-        <w:t xml:space="preserve">The explicit capacity of the methodology to generate highly disaggregated microdata and handle parameter uncertainty for stochastic predictive modeling</w:t>
-      </w:r>
-      <w:hyperlink w:anchor="ref-chrysanthopoulou2021">
         <w:r>
           <w:rPr>
             <w:rStyle w:val="Hyperlink"/>
@@ -2088,44 +2098,9 @@
     </w:p>
     <w:p>
       <w:pPr>
-        <w:pStyle w:val="FirstParagraph"/>
-      </w:pPr>
-      <w:r>
-        <w:t xml:space="preserve">This form will be piloted with a random sample of three included studies to refine consistency and ensure variable granularity. Two reviewers will perform the extraction independently, resolving discrepancies through consensus. The resulting data will be consolidated into a relational structure (e.g., tibble or data.frame) to facilitate transparent downstream analysis. The full extraction schema (exported as JSON/CSV) and corresponding R scripts will be made available via the Open Science Framework (OSF) upon study completion. For a detailed breakdown of the variables and the classification framework utilized, refer to the Data Charting Instrument (Appendix II).</w:t>
-      </w:r>
-    </w:p>
-    <w:bookmarkEnd w:id="29"/>
-    <w:bookmarkStart w:id="30" w:name="data-analysis-synthesis-and-presentation"/>
-    <w:p>
-      <w:pPr>
-        <w:pStyle w:val="Heading2"/>
-      </w:pPr>
-      <w:r>
-        <w:rPr>
-          <w:rStyle w:val="SectionNumber"/>
-        </w:rPr>
-        <w:t xml:space="preserve">3.4</w:t>
-      </w:r>
-      <w:r>
-        <w:tab/>
-      </w:r>
-      <w:r>
-        <w:t xml:space="preserve">Data Analysis, Synthesis, and Presentation</w:t>
-      </w:r>
-    </w:p>
-    <w:p>
-      <w:pPr>
-        <w:pStyle w:val="FirstParagraph"/>
-      </w:pPr>
-      <w:r>
-        <w:t xml:space="preserve">This scoping review adheres to the Joanna Briggs Institute methodology. We will conduct all data processing and visualization programmatically within the R statistical environment.</w:t>
-      </w:r>
-    </w:p>
-    <w:p>
-      <w:pPr>
         <w:numPr>
           <w:ilvl w:val="0"/>
-          <w:numId w:val="1017"/>
+          <w:numId w:val="1016"/>
         </w:numPr>
       </w:pPr>
       <w:r>
@@ -2133,51 +2108,104 @@
           <w:b/>
           <w:bCs/>
         </w:rPr>
-        <w:t xml:space="preserve">Descriptive Quantitative Analysis:</w:t>
-      </w:r>
-      <w:r>
-        <w:t xml:space="preserve"> </w:t>
-      </w:r>
-      <w:r>
-        <w:t xml:space="preserve">We will calculate absolute frequencies and percentages to characterize the literature by chronological distribution, geographic reach, taxonomic frameworks, cause categories, and analytical techniques. These analytical techniques will be categorized by their computational complexity, ranging from foundational deterministic methods to advanced predictive modeling, machine learning, and spatial analysis.</w:t>
-      </w:r>
-    </w:p>
-    <w:p>
-      <w:pPr>
-        <w:numPr>
-          <w:ilvl w:val="0"/>
-          <w:numId w:val="1017"/>
-        </w:numPr>
-      </w:pPr>
-      <w:r>
-        <w:rPr>
-          <w:b/>
-          <w:bCs/>
-        </w:rPr>
-        <w:t xml:space="preserve">Thematic Narrative Synthesis:</w:t>
-      </w:r>
-      <w:r>
-        <w:t xml:space="preserve"> </w:t>
-      </w:r>
-      <w:r>
-        <w:t xml:space="preserve">A narrative will accompany the extracted data, addressing the magnitude of garbage codes in data-scarce settings, the methodological diversity of the algorithms, and the conceptual transferability of these methods to preserve microdata validity for agent-based stochastic models. This includes addressing how uncorrected garbage codes disproportionately mask the true mortality burden in populations with higher social deprivation</w:t>
-      </w:r>
-      <w:hyperlink w:anchor="ref-malta2023">
+        <w:t xml:space="preserve">Microsimulation applicability:</w:t>
+      </w:r>
+      <w:r>
+        <w:t xml:space="preserve"> </w:t>
+      </w:r>
+      <w:r>
+        <w:t xml:space="preserve">The explicit capacity of the methodology to generate highly disaggregated microdata and handle parameter uncertainty for stochastic predictive modeling</w:t>
+      </w:r>
+      <w:hyperlink w:anchor="ref-chrysanthopoulou2021">
         <w:r>
           <w:rPr>
             <w:rStyle w:val="Hyperlink"/>
             <w:vertAlign w:val="superscript"/>
           </w:rPr>
-          <w:t xml:space="preserve">42</w:t>
+          <w:t xml:space="preserve">40</w:t>
         </w:r>
       </w:hyperlink>
       <w:r>
-        <w:t xml:space="preserve"> </w:t>
-      </w:r>
-      <w:r>
-        <w:t xml:space="preserve">and the risk of inappropriate centralization when macro-level regression algorithms are applied to highly localized municipal datasets</w:t>
-      </w:r>
-      <w:hyperlink w:anchor="ref-liu2022">
+        <w:t xml:space="preserve">.</w:t>
+      </w:r>
+    </w:p>
+    <w:p>
+      <w:pPr>
+        <w:pStyle w:val="FirstParagraph"/>
+      </w:pPr>
+      <w:r>
+        <w:t xml:space="preserve">This form will be piloted with a random sample of three included studies to refine consistency and ensure variable granularity. Two reviewers will perform the extraction independently, resolving discrepancies through consensus. The resulting data will be consolidated into a relational structure (e.g., tibble or data.frame) to facilitate transparent downstream analysis. The full extraction schema (exported as JSON/CSV) and corresponding R scripts will be made available via the Open Science Framework (OSF) upon study completion. In accordance with Joanna Briggs Institute (JBI) methodology for scoping reviews, a formal critical appraisal of included sources of evidence will not be conducted, as the objective of this review is to map and synthesize the breadth of existing quantitative methodologies rather than to evaluate the internal validity of individual studies. For a detailed breakdown of the variables and the classification framework utilized, refer to the Data Charting Instrument (Appendix II).</w:t>
+      </w:r>
+    </w:p>
+    <w:bookmarkEnd w:id="29"/>
+    <w:bookmarkStart w:id="30" w:name="data-analysis-synthesis-and-presentation"/>
+    <w:p>
+      <w:pPr>
+        <w:pStyle w:val="Heading2"/>
+      </w:pPr>
+      <w:r>
+        <w:rPr>
+          <w:rStyle w:val="SectionNumber"/>
+        </w:rPr>
+        <w:t xml:space="preserve">3.4</w:t>
+      </w:r>
+      <w:r>
+        <w:tab/>
+      </w:r>
+      <w:r>
+        <w:t xml:space="preserve">Data Analysis, Synthesis, and Presentation</w:t>
+      </w:r>
+    </w:p>
+    <w:p>
+      <w:pPr>
+        <w:pStyle w:val="FirstParagraph"/>
+      </w:pPr>
+      <w:r>
+        <w:t xml:space="preserve">This scoping review adheres to the Joanna Briggs Institute methodology. We will conduct all data processing and visualization programmatically within the R statistical environment.</w:t>
+      </w:r>
+    </w:p>
+    <w:p>
+      <w:pPr>
+        <w:numPr>
+          <w:ilvl w:val="0"/>
+          <w:numId w:val="1017"/>
+        </w:numPr>
+      </w:pPr>
+      <w:r>
+        <w:rPr>
+          <w:b/>
+          <w:bCs/>
+        </w:rPr>
+        <w:t xml:space="preserve">Descriptive Quantitative Analysis:</w:t>
+      </w:r>
+      <w:r>
+        <w:t xml:space="preserve"> </w:t>
+      </w:r>
+      <w:r>
+        <w:t xml:space="preserve">We will calculate absolute frequencies and percentages to characterize the literature by chronological distribution, geographic reach, taxonomic frameworks, cause categories, and analytical techniques. These analytical techniques will be categorized by their computational complexity, ranging from foundational deterministic methods to advanced predictive modeling, machine learning, and spatial analysis.</w:t>
+      </w:r>
+    </w:p>
+    <w:p>
+      <w:pPr>
+        <w:numPr>
+          <w:ilvl w:val="0"/>
+          <w:numId w:val="1017"/>
+        </w:numPr>
+      </w:pPr>
+      <w:r>
+        <w:rPr>
+          <w:b/>
+          <w:bCs/>
+        </w:rPr>
+        <w:t xml:space="preserve">Thematic Narrative Synthesis:</w:t>
+      </w:r>
+      <w:r>
+        <w:t xml:space="preserve"> </w:t>
+      </w:r>
+      <w:r>
+        <w:t xml:space="preserve">A narrative will accompany the extracted data, addressing the magnitude of garbage codes in data-scarce settings, the methodological diversity of the algorithms, and the conceptual transferability of these methods to preserve microdata validity for agent-based stochastic models. This includes addressing how uncorrected garbage codes disproportionately mask the true mortality burden in populations with higher social deprivation</w:t>
+      </w:r>
+      <w:hyperlink w:anchor="ref-malta2023">
         <w:r>
           <w:rPr>
             <w:rStyle w:val="Hyperlink"/>
@@ -2187,30 +2215,12 @@
         </w:r>
       </w:hyperlink>
       <w:r>
-        <w:t xml:space="preserve">.</w:t>
-      </w:r>
-    </w:p>
-    <w:p>
-      <w:pPr>
-        <w:numPr>
-          <w:ilvl w:val="0"/>
-          <w:numId w:val="1017"/>
-        </w:numPr>
-      </w:pPr>
-      <w:r>
-        <w:rPr>
-          <w:b/>
-          <w:bCs/>
-        </w:rPr>
-        <w:t xml:space="preserve">Mapping and Visualization:</w:t>
-      </w:r>
-      <w:r>
-        <w:t xml:space="preserve"> </w:t>
-      </w:r>
-      <w:r>
-        <w:t xml:space="preserve">To visualize the structure and knowledge gaps of the field, we will generate advanced graphics using ggplot2</w:t>
-      </w:r>
-      <w:hyperlink w:anchor="ref-wickham2016">
+        <w:t xml:space="preserve"> </w:t>
+      </w:r>
+      <w:r>
+        <w:t xml:space="preserve">and the risk of inappropriate centralization when macro-level regression algorithms are applied to highly localized municipal datasets</w:t>
+      </w:r>
+      <w:hyperlink w:anchor="ref-liu2022">
         <w:r>
           <w:rPr>
             <w:rStyle w:val="Hyperlink"/>
@@ -2220,12 +2230,30 @@
         </w:r>
       </w:hyperlink>
       <w:r>
-        <w:t xml:space="preserve"> </w:t>
-      </w:r>
-      <w:r>
-        <w:t xml:space="preserve">and igraph</w:t>
-      </w:r>
-      <w:hyperlink w:anchor="ref-csardi2006">
+        <w:t xml:space="preserve">.</w:t>
+      </w:r>
+    </w:p>
+    <w:p>
+      <w:pPr>
+        <w:numPr>
+          <w:ilvl w:val="0"/>
+          <w:numId w:val="1017"/>
+        </w:numPr>
+      </w:pPr>
+      <w:r>
+        <w:rPr>
+          <w:b/>
+          <w:bCs/>
+        </w:rPr>
+        <w:t xml:space="preserve">Mapping and Visualization:</w:t>
+      </w:r>
+      <w:r>
+        <w:t xml:space="preserve"> </w:t>
+      </w:r>
+      <w:r>
+        <w:t xml:space="preserve">To visualize the structure and knowledge gaps of the field, we will generate advanced graphics using ggplot2</w:t>
+      </w:r>
+      <w:hyperlink w:anchor="ref-wickham2016">
         <w:r>
           <w:rPr>
             <w:rStyle w:val="Hyperlink"/>
@@ -2235,12 +2263,27 @@
         </w:r>
       </w:hyperlink>
       <w:r>
+        <w:t xml:space="preserve"> </w:t>
+      </w:r>
+      <w:r>
+        <w:t xml:space="preserve">and igraph</w:t>
+      </w:r>
+      <w:hyperlink w:anchor="ref-csardi2006">
+        <w:r>
+          <w:rPr>
+            <w:rStyle w:val="Hyperlink"/>
+            <w:vertAlign w:val="superscript"/>
+          </w:rPr>
+          <w:t xml:space="preserve">46</w:t>
+        </w:r>
+      </w:hyperlink>
+      <w:r>
         <w:t xml:space="preserve">. This will include structured evidence tables cross-referencing correction methods with their input data requirements, two-dimensional heatmaps mapping analytical methods against specific ICD Chapters, and flow network diagrams illustrating the technical pathway required to connect traditional vital statistics with microsimulation parameterization.</w:t>
       </w:r>
     </w:p>
     <w:bookmarkEnd w:id="30"/>
     <w:bookmarkEnd w:id="31"/>
-    <w:bookmarkStart w:id="32" w:name="conflicts-of-interest"/>
+    <w:bookmarkStart w:id="32" w:name="ethical-approval"/>
     <w:p>
       <w:pPr>
         <w:pStyle w:val="Heading1"/>
@@ -2255,6 +2298,60 @@
         <w:tab/>
       </w:r>
       <w:r>
+        <w:t xml:space="preserve">Ethical Approval</w:t>
+      </w:r>
+    </w:p>
+    <w:p>
+      <w:pPr>
+        <w:pStyle w:val="FirstParagraph"/>
+      </w:pPr>
+      <w:r>
+        <w:t xml:space="preserve">As this scoping review relies exclusively on publicly available published scientific literature, official institutional technical reports, and aggregated population-based secondary data (Civil Registration and Vital Statistics systems), formal ethical approval by an Institutional Review Board (IRB) or ethics committee was not required.</w:t>
+      </w:r>
+    </w:p>
+    <w:bookmarkEnd w:id="32"/>
+    <w:bookmarkStart w:id="33" w:name="availability-of-data-and-materials"/>
+    <w:p>
+      <w:pPr>
+        <w:pStyle w:val="Heading1"/>
+      </w:pPr>
+      <w:r>
+        <w:rPr>
+          <w:rStyle w:val="SectionNumber"/>
+        </w:rPr>
+        <w:t xml:space="preserve">5</w:t>
+      </w:r>
+      <w:r>
+        <w:tab/>
+      </w:r>
+      <w:r>
+        <w:t xml:space="preserve">Availability of Data and Materials</w:t>
+      </w:r>
+    </w:p>
+    <w:p>
+      <w:pPr>
+        <w:pStyle w:val="FirstParagraph"/>
+      </w:pPr>
+      <w:r>
+        <w:t xml:space="preserve">All datasets generated or analyzed during this study are included in this published protocol and its supplementary information files. The complete R scripts, customized search syntaxes, and electronic data charting instruments are publicly accessible via the Open Science Framework (OSF) repository [10.17605/OSF.IO/ZP9AQ]. Any additional customized scripts, codebooks, or intermediate extraction matrices are available from the corresponding author upon reasonable request.</w:t>
+      </w:r>
+    </w:p>
+    <w:bookmarkEnd w:id="33"/>
+    <w:bookmarkStart w:id="34" w:name="conflicts-of-interest"/>
+    <w:p>
+      <w:pPr>
+        <w:pStyle w:val="Heading1"/>
+      </w:pPr>
+      <w:r>
+        <w:rPr>
+          <w:rStyle w:val="SectionNumber"/>
+        </w:rPr>
+        <w:t xml:space="preserve">6</w:t>
+      </w:r>
+      <w:r>
+        <w:tab/>
+      </w:r>
+      <w:r>
         <w:t xml:space="preserve">Conflicts of Interest</w:t>
       </w:r>
     </w:p>
@@ -2263,7 +2360,198 @@
         <w:pStyle w:val="FirstParagraph"/>
       </w:pPr>
       <w:r>
-        <w:t xml:space="preserve">The authors declare no competing interests. This scoping review was conducted for academic and methodological purposes only, with no commercial, financial, or institutional support that could be construed as a potential conflict of interest.</w:t>
+        <w:t xml:space="preserve">The authors declare that they have no competing interests. This scoping review was conducted solely for academic, educational, and methodological research purposes, with no commercial, financial, corporate, or industrial support that could be construed as a potential conflict of interest.</w:t>
+      </w:r>
+    </w:p>
+    <w:bookmarkEnd w:id="34"/>
+    <w:bookmarkStart w:id="35" w:name="funding"/>
+    <w:p>
+      <w:pPr>
+        <w:pStyle w:val="Heading1"/>
+      </w:pPr>
+      <w:r>
+        <w:rPr>
+          <w:rStyle w:val="SectionNumber"/>
+        </w:rPr>
+        <w:t xml:space="preserve">7</w:t>
+      </w:r>
+      <w:r>
+        <w:tab/>
+      </w:r>
+      <w:r>
+        <w:t xml:space="preserve">Funding</w:t>
+      </w:r>
+    </w:p>
+    <w:p>
+      <w:pPr>
+        <w:pStyle w:val="FirstParagraph"/>
+      </w:pPr>
+      <w:r>
+        <w:t xml:space="preserve">This research received no specific grant from any funding agency in the public, commercial, or not-for-profit sectors. The study was conducted entirely through the academic time, institutional affiliation resources, and professional dedication of the authors.</w:t>
+      </w:r>
+    </w:p>
+    <w:bookmarkEnd w:id="35"/>
+    <w:bookmarkStart w:id="36" w:name="authors-contributions"/>
+    <w:p>
+      <w:pPr>
+        <w:pStyle w:val="Heading1"/>
+      </w:pPr>
+      <w:r>
+        <w:rPr>
+          <w:rStyle w:val="SectionNumber"/>
+        </w:rPr>
+        <w:t xml:space="preserve">8</w:t>
+      </w:r>
+      <w:r>
+        <w:tab/>
+      </w:r>
+      <w:r>
+        <w:t xml:space="preserve">Authors’ Contributions</w:t>
+      </w:r>
+    </w:p>
+    <w:p>
+      <w:pPr>
+        <w:numPr>
+          <w:ilvl w:val="0"/>
+          <w:numId w:val="1018"/>
+        </w:numPr>
+      </w:pPr>
+      <w:r>
+        <w:rPr>
+          <w:b/>
+          <w:bCs/>
+        </w:rPr>
+        <w:t xml:space="preserve">Giovanni Guevara-Vásquez</w:t>
+      </w:r>
+      <w:r>
+        <w:t xml:space="preserve">: Conceptualization, Methodology, Software, Validation, Formal analysis, Investigation, Writing – Original Draft, Visualization, Project administration.</w:t>
+      </w:r>
+    </w:p>
+    <w:p>
+      <w:pPr>
+        <w:numPr>
+          <w:ilvl w:val="0"/>
+          <w:numId w:val="1018"/>
+        </w:numPr>
+      </w:pPr>
+      <w:r>
+        <w:rPr>
+          <w:b/>
+          <w:bCs/>
+        </w:rPr>
+        <w:t xml:space="preserve">Pablo Salazar-Colocho</w:t>
+      </w:r>
+      <w:r>
+        <w:t xml:space="preserve">: Conceptualization, Methodology, Writing – Review &amp; Editing.</w:t>
+      </w:r>
+    </w:p>
+    <w:p>
+      <w:pPr>
+        <w:numPr>
+          <w:ilvl w:val="0"/>
+          <w:numId w:val="1018"/>
+        </w:numPr>
+      </w:pPr>
+      <w:r>
+        <w:rPr>
+          <w:b/>
+          <w:bCs/>
+        </w:rPr>
+        <w:t xml:space="preserve">David Tejada-Peña</w:t>
+      </w:r>
+      <w:r>
+        <w:t xml:space="preserve">: Investigation, Resources, Data curation, Writing – Review &amp; Editing.</w:t>
+      </w:r>
+    </w:p>
+    <w:p>
+      <w:pPr>
+        <w:numPr>
+          <w:ilvl w:val="0"/>
+          <w:numId w:val="1018"/>
+        </w:numPr>
+      </w:pPr>
+      <w:r>
+        <w:rPr>
+          <w:b/>
+          <w:bCs/>
+        </w:rPr>
+        <w:t xml:space="preserve">Hazel García-Sanchez</w:t>
+      </w:r>
+      <w:r>
+        <w:t xml:space="preserve">: Investigation, Resources, Data curation, Writing – Review &amp; Editing.</w:t>
+      </w:r>
+    </w:p>
+    <w:p>
+      <w:pPr>
+        <w:numPr>
+          <w:ilvl w:val="0"/>
+          <w:numId w:val="1018"/>
+        </w:numPr>
+      </w:pPr>
+      <w:r>
+        <w:rPr>
+          <w:b/>
+          <w:bCs/>
+        </w:rPr>
+        <w:t xml:space="preserve">César Gavidia-Leiva</w:t>
+      </w:r>
+      <w:r>
+        <w:t xml:space="preserve">: Investigation, Resources, Data curation, Writing – Review &amp; Editing.</w:t>
+      </w:r>
+    </w:p>
+    <w:p>
+      <w:pPr>
+        <w:numPr>
+          <w:ilvl w:val="0"/>
+          <w:numId w:val="1018"/>
+        </w:numPr>
+      </w:pPr>
+      <w:r>
+        <w:rPr>
+          <w:b/>
+          <w:bCs/>
+        </w:rPr>
+        <w:t xml:space="preserve">Mirna Melendez-Gálvez</w:t>
+      </w:r>
+      <w:r>
+        <w:t xml:space="preserve">: Investigation, Resources, Data curation, Writing – Review &amp; Editing.</w:t>
+      </w:r>
+    </w:p>
+    <w:p>
+      <w:pPr>
+        <w:numPr>
+          <w:ilvl w:val="0"/>
+          <w:numId w:val="1018"/>
+        </w:numPr>
+      </w:pPr>
+      <w:r>
+        <w:rPr>
+          <w:b/>
+          <w:bCs/>
+        </w:rPr>
+        <w:t xml:space="preserve">Kevin Siliezar-Madrid</w:t>
+      </w:r>
+      <w:r>
+        <w:t xml:space="preserve">: Methodology (Information Retrieval), Investigation, Data Curation (Search execution in R), Writing – Review &amp; Editing.</w:t>
+      </w:r>
+    </w:p>
+    <w:p>
+      <w:pPr>
+        <w:pStyle w:val="Compact"/>
+        <w:numPr>
+          <w:ilvl w:val="0"/>
+          <w:numId w:val="1019"/>
+        </w:numPr>
+      </w:pPr>
+      <w:r>
+        <w:rPr>
+          <w:b/>
+          <w:bCs/>
+        </w:rPr>
+        <w:t xml:space="preserve">Alejandra Rivas-Portillo</w:t>
+      </w:r>
+      <w:r>
+        <w:t xml:space="preserve">: Methodology, Investigation (Dual independent screening and selection), Data Curation, Writing – Review &amp; Editing.</w:t>
       </w:r>
     </w:p>
     <w:p>
@@ -2273,8 +2561,8 @@
         </w:pict>
       </w:r>
     </w:p>
-    <w:bookmarkEnd w:id="32"/>
-    <w:bookmarkStart w:id="100" w:name="references"/>
+    <w:bookmarkEnd w:id="36"/>
+    <w:bookmarkStart w:id="105" w:name="references"/>
     <w:p>
       <w:pPr>
         <w:pStyle w:val="Heading1"/>
@@ -2283,7 +2571,7 @@
         <w:rPr>
           <w:rStyle w:val="SectionNumber"/>
         </w:rPr>
-        <w:t xml:space="preserve">5</w:t>
+        <w:t xml:space="preserve">9</w:t>
       </w:r>
       <w:r>
         <w:tab/>
@@ -2292,8 +2580,8 @@
         <w:t xml:space="preserve">References</w:t>
       </w:r>
     </w:p>
-    <w:bookmarkStart w:id="99" w:name="refs"/>
-    <w:bookmarkStart w:id="33" w:name="ref-setel2007"/>
+    <w:bookmarkStart w:id="104" w:name="refs"/>
+    <w:bookmarkStart w:id="37" w:name="ref-mathers2005"/>
     <w:p>
       <w:pPr>
         <w:pStyle w:val="Bibliography"/>
@@ -2308,20 +2596,39 @@
         <w:t xml:space="preserve">	</w:t>
       </w:r>
       <w:r>
+        <w:t xml:space="preserve">Mathers CD, Fat DM, Inoue M, Rao C, Lopez AD. Counting the dead and what they died from: An assessment of the global status of cause of death data. Bulletin of the World Health Organization. 2005;83:171–7.</w:t>
+      </w:r>
+    </w:p>
+    <w:bookmarkEnd w:id="37"/>
+    <w:bookmarkStart w:id="38" w:name="ref-setel2007"/>
+    <w:p>
+      <w:pPr>
+        <w:pStyle w:val="Bibliography"/>
+      </w:pPr>
+      <w:r>
+        <w:t xml:space="preserve">2.</w:t>
+      </w:r>
+      <w:r>
+        <w:t xml:space="preserve"> </w:t>
+      </w:r>
+      <w:r>
+        <w:t xml:space="preserve">	</w:t>
+      </w:r>
+      <w:r>
         <w:t xml:space="preserve">Setel P, Macfarlane S, Szreter S, Mikkelsen L, Jha P, Stout S, et al.</w:t>
       </w:r>
       <w:r>
         <w:t xml:space="preserve"> A scandal of invisibility: Making everyone count by counting everyone. Lancet. 2007;370:1569–77.</w:t>
       </w:r>
     </w:p>
-    <w:bookmarkEnd w:id="33"/>
-    <w:bookmarkStart w:id="34" w:name="ref-mathers2005"/>
+    <w:bookmarkEnd w:id="38"/>
+    <w:bookmarkStart w:id="40" w:name="ref-abouzahr2015"/>
     <w:p>
       <w:pPr>
         <w:pStyle w:val="Bibliography"/>
       </w:pPr>
       <w:r>
-        <w:t xml:space="preserve">2.</w:t>
+        <w:t xml:space="preserve">3.</w:t>
       </w:r>
       <w:r>
         <w:t xml:space="preserve"> </w:t>
@@ -2330,28 +2637,9 @@
         <w:t xml:space="preserve">	</w:t>
       </w:r>
       <w:r>
-        <w:t xml:space="preserve">Mathers CD, Fat DM, Inoue M, Rao C, Lopez AD. Counting the dead and what they died from: An assessment of the global status of cause of death data. Bulletin of the World Health Organization. 2005;83:171–7.</w:t>
-      </w:r>
-    </w:p>
-    <w:bookmarkEnd w:id="34"/>
-    <w:bookmarkStart w:id="36" w:name="ref-abouzahr2015"/>
-    <w:p>
-      <w:pPr>
-        <w:pStyle w:val="Bibliography"/>
-      </w:pPr>
-      <w:r>
-        <w:t xml:space="preserve">3.</w:t>
-      </w:r>
-      <w:r>
-        <w:t xml:space="preserve"> </w:t>
-      </w:r>
-      <w:r>
-        <w:t xml:space="preserve">	</w:t>
-      </w:r>
-      <w:r>
         <w:t xml:space="preserve">AbouZahr C, Savigny D de, Mikkelsen L, Setel PW, Lozano R, Nichols E, et al. Civil registration and vital statistics: Progress in the data revolution for counting and accountability. The Lancet. 2015;386(10001):1373–85. doi:</w:t>
       </w:r>
-      <w:hyperlink r:id="rId35">
+      <w:hyperlink r:id="rId39">
         <w:r>
           <w:rPr>
             <w:rStyle w:val="Hyperlink"/>
@@ -2360,8 +2648,8 @@
         </w:r>
       </w:hyperlink>
     </w:p>
-    <w:bookmarkEnd w:id="36"/>
-    <w:bookmarkStart w:id="38" w:name="ref-iburg2020"/>
+    <w:bookmarkEnd w:id="40"/>
+    <w:bookmarkStart w:id="42" w:name="ref-iburg2020"/>
     <w:p>
       <w:pPr>
         <w:pStyle w:val="Bibliography"/>
@@ -2378,7 +2666,7 @@
       <w:r>
         <w:t xml:space="preserve">Iburg KM, Mikkelsen L, Adair T, Lopez AD. Are cause of death data fit for purpose? Evidence from 20 countries at different levels of socio-economic development. PLoS ONE. 2020;15(8):e0237539. doi:</w:t>
       </w:r>
-      <w:hyperlink r:id="rId37">
+      <w:hyperlink r:id="rId41">
         <w:r>
           <w:rPr>
             <w:rStyle w:val="Hyperlink"/>
@@ -2387,8 +2675,8 @@
         </w:r>
       </w:hyperlink>
     </w:p>
-    <w:bookmarkEnd w:id="38"/>
-    <w:bookmarkStart w:id="39" w:name="ref-murray1996"/>
+    <w:bookmarkEnd w:id="42"/>
+    <w:bookmarkStart w:id="43" w:name="ref-murray1996"/>
     <w:p>
       <w:pPr>
         <w:pStyle w:val="Bibliography"/>
@@ -2406,8 +2694,8 @@
         <w:t xml:space="preserve">Murray C, Lopez A. The global burden of disease: A comprehensive assessment of mortality and disability from diseases, injuries and risk factors in 1990 and projected to 2020. Boston: Harvard School of Public Health; 1996.</w:t>
       </w:r>
     </w:p>
-    <w:bookmarkEnd w:id="39"/>
-    <w:bookmarkStart w:id="40" w:name="ref-naghavi2020"/>
+    <w:bookmarkEnd w:id="43"/>
+    <w:bookmarkStart w:id="44" w:name="ref-naghavi2020"/>
     <w:p>
       <w:pPr>
         <w:pStyle w:val="Bibliography"/>
@@ -2440,8 +2728,8 @@
         <w:t xml:space="preserve">codes equally problematic? BMC Med. 2020;18(1):55.</w:t>
       </w:r>
     </w:p>
-    <w:bookmarkEnd w:id="40"/>
-    <w:bookmarkStart w:id="42" w:name="ref-who2022"/>
+    <w:bookmarkEnd w:id="44"/>
+    <w:bookmarkStart w:id="46" w:name="ref-who2022"/>
     <w:p>
       <w:pPr>
         <w:pStyle w:val="Bibliography"/>
@@ -2461,7 +2749,7 @@
       <w:r>
         <w:t xml:space="preserve"> </w:t>
       </w:r>
-      <w:hyperlink r:id="rId41">
+      <w:hyperlink r:id="rId45">
         <w:r>
           <w:rPr>
             <w:rStyle w:val="Hyperlink"/>
@@ -2470,8 +2758,8 @@
         </w:r>
       </w:hyperlink>
     </w:p>
-    <w:bookmarkEnd w:id="42"/>
-    <w:bookmarkStart w:id="44" w:name="ref-ahern2011"/>
+    <w:bookmarkEnd w:id="46"/>
+    <w:bookmarkStart w:id="48" w:name="ref-ahern2011"/>
     <w:p>
       <w:pPr>
         <w:pStyle w:val="Bibliography"/>
@@ -2488,7 +2776,7 @@
       <w:r>
         <w:t xml:space="preserve">Ahern RM, Lozano R, Naghavi M, Foreman K, Gakidou E, Murray CJ. Improving the public health utility of global cardiovascular mortality data: The rise of ischemic heart disease. Population Health Metrics. 2011 Dec;9(1):8. doi:</w:t>
       </w:r>
-      <w:hyperlink r:id="rId43">
+      <w:hyperlink r:id="rId47">
         <w:r>
           <w:rPr>
             <w:rStyle w:val="Hyperlink"/>
@@ -2497,8 +2785,8 @@
         </w:r>
       </w:hyperlink>
     </w:p>
-    <w:bookmarkEnd w:id="44"/>
-    <w:bookmarkStart w:id="45" w:name="ref-salerno2025"/>
+    <w:bookmarkEnd w:id="48"/>
+    <w:bookmarkStart w:id="49" w:name="ref-salerno2025"/>
     <w:p>
       <w:pPr>
         <w:pStyle w:val="Bibliography"/>
@@ -2516,8 +2804,8 @@
         <w:t xml:space="preserve">Salerno P, Cotton A, Chen Z, Nascimento B, Petermann-Rocha F, Deo S. Forecasting ischemic heart disease, stroke, and peripheral artery disease mortality in brazil through 2030. Arquivos Brasileiros de Cardiologia. 2025;122(1):e2024012.</w:t>
       </w:r>
     </w:p>
-    <w:bookmarkEnd w:id="45"/>
-    <w:bookmarkStart w:id="47" w:name="ref-bigoni2021"/>
+    <w:bookmarkEnd w:id="49"/>
+    <w:bookmarkStart w:id="51" w:name="ref-bigoni2021"/>
     <w:p>
       <w:pPr>
         <w:pStyle w:val="Bibliography"/>
@@ -2546,7 +2834,7 @@
       <w:r>
         <w:t xml:space="preserve">blica. 2021;55:106. doi:</w:t>
       </w:r>
-      <w:hyperlink r:id="rId46">
+      <w:hyperlink r:id="rId50">
         <w:r>
           <w:rPr>
             <w:rStyle w:val="Hyperlink"/>
@@ -2555,8 +2843,8 @@
         </w:r>
       </w:hyperlink>
     </w:p>
-    <w:bookmarkEnd w:id="47"/>
-    <w:bookmarkStart w:id="49" w:name="ref-cunha2022"/>
+    <w:bookmarkEnd w:id="51"/>
+    <w:bookmarkStart w:id="53" w:name="ref-cunha2022"/>
     <w:p>
       <w:pPr>
         <w:pStyle w:val="Bibliography"/>
@@ -2573,7 +2861,7 @@
       <w:r>
         <w:t xml:space="preserve">Cunha AR da, Bigoni A, Antunes JLF, Hugo FN. Impact of redistributing deaths by ill-defined causes in oral and oropharyngeal cancer mortality in brazil. Brazilian Oral Research. 2022;36:e117. doi:</w:t>
       </w:r>
-      <w:hyperlink r:id="rId48">
+      <w:hyperlink r:id="rId52">
         <w:r>
           <w:rPr>
             <w:rStyle w:val="Hyperlink"/>
@@ -2582,8 +2870,8 @@
         </w:r>
       </w:hyperlink>
     </w:p>
-    <w:bookmarkEnd w:id="49"/>
-    <w:bookmarkStart w:id="50" w:name="ref-hart2020"/>
+    <w:bookmarkEnd w:id="53"/>
+    <w:bookmarkStart w:id="54" w:name="ref-hart2020"/>
     <w:p>
       <w:pPr>
         <w:pStyle w:val="Bibliography"/>
@@ -2604,8 +2892,8 @@
         <w:t xml:space="preserve"> Improving medical certification of cause of death: Effective strategies and approaches based on experiences from the data for health initiative. BMC Public Health. 2020;20(1):1083.</w:t>
       </w:r>
     </w:p>
-    <w:bookmarkEnd w:id="50"/>
-    <w:bookmarkStart w:id="51" w:name="ref-naghavi2010"/>
+    <w:bookmarkEnd w:id="54"/>
+    <w:bookmarkStart w:id="55" w:name="ref-miki2018"/>
     <w:p>
       <w:pPr>
         <w:pStyle w:val="Bibliography"/>
@@ -2620,20 +2908,61 @@
         <w:t xml:space="preserve">	</w:t>
       </w:r>
       <w:r>
+        <w:t xml:space="preserve">Miki J et al.</w:t>
+      </w:r>
+      <w:r>
+        <w:t xml:space="preserve"> Saving lives through certifying deaths: Assessing the impact of two interventions to improve cause of death data in peru. BMC Public Health. 2018;18(1):1329.</w:t>
+      </w:r>
+    </w:p>
+    <w:bookmarkEnd w:id="55"/>
+    <w:bookmarkStart w:id="56" w:name="ref-foreman2016"/>
+    <w:p>
+      <w:pPr>
+        <w:pStyle w:val="Bibliography"/>
+      </w:pPr>
+      <w:r>
+        <w:t xml:space="preserve">14.</w:t>
+      </w:r>
+      <w:r>
+        <w:t xml:space="preserve"> </w:t>
+      </w:r>
+      <w:r>
+        <w:t xml:space="preserve">	</w:t>
+      </w:r>
+      <w:r>
+        <w:t xml:space="preserve">Foreman K, Naghavi M, Ezzati M. Improving the usefulness of US mortality data: New methods for reclassification of underlying cause of death. Popul Health Metr. 2016;14:14.</w:t>
+      </w:r>
+    </w:p>
+    <w:bookmarkEnd w:id="56"/>
+    <w:bookmarkStart w:id="57" w:name="ref-naghavi2010"/>
+    <w:p>
+      <w:pPr>
+        <w:pStyle w:val="Bibliography"/>
+      </w:pPr>
+      <w:r>
+        <w:t xml:space="preserve">15.</w:t>
+      </w:r>
+      <w:r>
+        <w:t xml:space="preserve"> </w:t>
+      </w:r>
+      <w:r>
+        <w:t xml:space="preserve">	</w:t>
+      </w:r>
+      <w:r>
         <w:t xml:space="preserve">Naghavi M, Makela S, Foreman K, et al.</w:t>
       </w:r>
       <w:r>
         <w:t xml:space="preserve"> Algorithms for enhancing public health utility of national causes-of-death data. Popul Health Metr. 2010;8(1):9.</w:t>
       </w:r>
     </w:p>
-    <w:bookmarkEnd w:id="51"/>
-    <w:bookmarkStart w:id="52" w:name="ref-gbd2016"/>
+    <w:bookmarkEnd w:id="57"/>
+    <w:bookmarkStart w:id="58" w:name="ref-gbd2016"/>
     <w:p>
       <w:pPr>
         <w:pStyle w:val="Bibliography"/>
       </w:pPr>
       <w:r>
-        <w:t xml:space="preserve">14.</w:t>
+        <w:t xml:space="preserve">16.</w:t>
       </w:r>
       <w:r>
         <w:t xml:space="preserve"> </w:t>
@@ -2645,14 +2974,14 @@
         <w:t xml:space="preserve">GBD 2016 Causes of Death Collaborators. Global, regional, and national age-sex specific mortality for 264 causes of death, 1980–2016: A systematic analysis for the global burden of disease study 2016. The Lancet. 2017;390(10100):1151–210.</w:t>
       </w:r>
     </w:p>
-    <w:bookmarkEnd w:id="52"/>
-    <w:bookmarkStart w:id="54" w:name="ref-gbd2017"/>
+    <w:bookmarkEnd w:id="58"/>
+    <w:bookmarkStart w:id="60" w:name="ref-gbd2017"/>
     <w:p>
       <w:pPr>
         <w:pStyle w:val="Bibliography"/>
       </w:pPr>
       <w:r>
-        <w:t xml:space="preserve">15.</w:t>
+        <w:t xml:space="preserve">17.</w:t>
       </w:r>
       <w:r>
         <w:t xml:space="preserve"> </w:t>
@@ -2663,7 +2992,7 @@
       <w:r>
         <w:t xml:space="preserve">GBD 2017 Causes of Death Collaborators. Global, regional, and national age-sex-specific mortality for 282 causes of death in 195 countries and territories, 1980–2017: A systematic analysis for the global burden of disease study 2017. The Lancet. 2018;392(10159):1736–88. doi:</w:t>
       </w:r>
-      <w:hyperlink r:id="rId53">
+      <w:hyperlink r:id="rId59">
         <w:r>
           <w:rPr>
             <w:rStyle w:val="Hyperlink"/>
@@ -2672,14 +3001,14 @@
         </w:r>
       </w:hyperlink>
     </w:p>
-    <w:bookmarkEnd w:id="54"/>
-    <w:bookmarkStart w:id="55" w:name="ref-murray2008"/>
+    <w:bookmarkEnd w:id="60"/>
+    <w:bookmarkStart w:id="61" w:name="ref-murray2008"/>
     <w:p>
       <w:pPr>
         <w:pStyle w:val="Bibliography"/>
       </w:pPr>
       <w:r>
-        <w:t xml:space="preserve">16.</w:t>
+        <w:t xml:space="preserve">18.</w:t>
       </w:r>
       <w:r>
         <w:t xml:space="preserve"> </w:t>
@@ -2691,14 +3020,14 @@
         <w:t xml:space="preserve">Murray CJ, Dias RH, Kulkarni SC, Lozano R, Stevens GA, Ezzati M. Improving the comparability of diabetes mortality statistics in the u.s. And mexico. Diabetes Care. 2008;31(3):451–8.</w:t>
       </w:r>
     </w:p>
-    <w:bookmarkEnd w:id="55"/>
-    <w:bookmarkStart w:id="56" w:name="ref-foreman2016"/>
+    <w:bookmarkEnd w:id="61"/>
+    <w:bookmarkStart w:id="62" w:name="ref-johnson2021"/>
     <w:p>
       <w:pPr>
         <w:pStyle w:val="Bibliography"/>
       </w:pPr>
       <w:r>
-        <w:t xml:space="preserve">17.</w:t>
+        <w:t xml:space="preserve">19.</w:t>
       </w:r>
       <w:r>
         <w:t xml:space="preserve"> </w:t>
@@ -2707,17 +3036,20 @@
         <w:t xml:space="preserve">	</w:t>
       </w:r>
       <w:r>
-        <w:t xml:space="preserve">Foreman K, Naghavi M, Ezzati M. Improving the usefulness of US mortality data: New methods for reclassification of underlying cause of death. Popul Health Metr. 2016;14:14.</w:t>
-      </w:r>
-    </w:p>
-    <w:bookmarkEnd w:id="56"/>
-    <w:bookmarkStart w:id="57" w:name="ref-johnson2021"/>
+        <w:t xml:space="preserve">Johnson S et al.</w:t>
+      </w:r>
+      <w:r>
+        <w:t xml:space="preserve"> Public health utility of cause of death data: Applying empirical algorithms to improve data quality. BMC Med Inform Decis Mak. 2021;21(1):175.</w:t>
+      </w:r>
+    </w:p>
+    <w:bookmarkEnd w:id="62"/>
+    <w:bookmarkStart w:id="63" w:name="ref-franca2014"/>
     <w:p>
       <w:pPr>
         <w:pStyle w:val="Bibliography"/>
       </w:pPr>
       <w:r>
-        <w:t xml:space="preserve">18.</w:t>
+        <w:t xml:space="preserve">20.</w:t>
       </w:r>
       <w:r>
         <w:t xml:space="preserve"> </w:t>
@@ -2726,20 +3058,32 @@
         <w:t xml:space="preserve">	</w:t>
       </w:r>
       <w:r>
-        <w:t xml:space="preserve">Johnson S et al.</w:t>
-      </w:r>
-      <w:r>
-        <w:t xml:space="preserve"> Public health utility of cause of death data: Applying empirical algorithms to improve data quality. BMC Med Inform Decis Mak. 2021;21(1):175.</w:t>
-      </w:r>
-    </w:p>
-    <w:bookmarkEnd w:id="57"/>
-    <w:bookmarkStart w:id="58" w:name="ref-franca2014"/>
+        <w:t xml:space="preserve">França E et al.</w:t>
+      </w:r>
+      <w:r>
+        <w:t xml:space="preserve"> Ill-defined causes of death in brazil: A redistribution method based on the investigation of such causes. Rev Sa</w:t>
+      </w:r>
+      <w:r>
+        <w:t xml:space="preserve">ú</w:t>
+      </w:r>
+      <w:r>
+        <w:t xml:space="preserve">de P</w:t>
+      </w:r>
+      <w:r>
+        <w:t xml:space="preserve">ú</w:t>
+      </w:r>
+      <w:r>
+        <w:t xml:space="preserve">blica. 2014;48(4):671–81.</w:t>
+      </w:r>
+    </w:p>
+    <w:bookmarkEnd w:id="63"/>
+    <w:bookmarkStart w:id="64" w:name="ref-franca2019a"/>
     <w:p>
       <w:pPr>
         <w:pStyle w:val="Bibliography"/>
       </w:pPr>
       <w:r>
-        <w:t xml:space="preserve">19.</w:t>
+        <w:t xml:space="preserve">21.</w:t>
       </w:r>
       <w:r>
         <w:t xml:space="preserve"> </w:t>
@@ -2748,32 +3092,17 @@
         <w:t xml:space="preserve">	</w:t>
       </w:r>
       <w:r>
-        <w:t xml:space="preserve">França E et al.</w:t>
-      </w:r>
-      <w:r>
-        <w:t xml:space="preserve"> Ill-defined causes of death in brazil: A redistribution method based on the investigation of such causes. Rev Sa</w:t>
-      </w:r>
-      <w:r>
-        <w:t xml:space="preserve">ú</w:t>
-      </w:r>
-      <w:r>
-        <w:t xml:space="preserve">de P</w:t>
-      </w:r>
-      <w:r>
-        <w:t xml:space="preserve">ú</w:t>
-      </w:r>
-      <w:r>
-        <w:t xml:space="preserve">blica. 2014;48(4):671–81.</w:t>
-      </w:r>
-    </w:p>
-    <w:bookmarkEnd w:id="58"/>
-    <w:bookmarkStart w:id="59" w:name="ref-franca2019a"/>
+        <w:t xml:space="preserve">França EB, Ishitani LH, Teixeira RA, Cunha CC da, Marinho MF. Improving the usefulness of mortality data: Reclassification of ill-defined causes based on medical records and home interviews in brazil. Revista Brasileira de Epidemiologia. 2019;22:e190010.</w:t>
+      </w:r>
+    </w:p>
+    <w:bookmarkEnd w:id="64"/>
+    <w:bookmarkStart w:id="65" w:name="ref-franca2019b"/>
     <w:p>
       <w:pPr>
         <w:pStyle w:val="Bibliography"/>
       </w:pPr>
       <w:r>
-        <w:t xml:space="preserve">20.</w:t>
+        <w:t xml:space="preserve">22.</w:t>
       </w:r>
       <w:r>
         <w:t xml:space="preserve"> </w:t>
@@ -2782,17 +3111,17 @@
         <w:t xml:space="preserve">	</w:t>
       </w:r>
       <w:r>
-        <w:t xml:space="preserve">França EB, Ishitani LH, Teixeira RA, Cunha CC da, Marinho MF. Improving the usefulness of mortality data: Reclassification of ill-defined causes based on medical records and home interviews in brazil. Revista Brasileira de Epidemiologia. 2019;22:e190010.</w:t>
-      </w:r>
-    </w:p>
-    <w:bookmarkEnd w:id="59"/>
-    <w:bookmarkStart w:id="60" w:name="ref-franca2019b"/>
+        <w:t xml:space="preserve">França EB. Garbage codes assigned as cause-of-death in health statistics. Revista Brasileira de Epidemiologia. 2019;22:e190001.</w:t>
+      </w:r>
+    </w:p>
+    <w:bookmarkEnd w:id="65"/>
+    <w:bookmarkStart w:id="67" w:name="ref-stevens2010"/>
     <w:p>
       <w:pPr>
         <w:pStyle w:val="Bibliography"/>
       </w:pPr>
       <w:r>
-        <w:t xml:space="preserve">21.</w:t>
+        <w:t xml:space="preserve">23.</w:t>
       </w:r>
       <w:r>
         <w:t xml:space="preserve"> </w:t>
@@ -2801,28 +3130,9 @@
         <w:t xml:space="preserve">	</w:t>
       </w:r>
       <w:r>
-        <w:t xml:space="preserve">França EB. Garbage codes assigned as cause-of-death in health statistics. Revista Brasileira de Epidemiologia. 2019;22:e190001.</w:t>
-      </w:r>
-    </w:p>
-    <w:bookmarkEnd w:id="60"/>
-    <w:bookmarkStart w:id="62" w:name="ref-stevens2010"/>
-    <w:p>
-      <w:pPr>
-        <w:pStyle w:val="Bibliography"/>
-      </w:pPr>
-      <w:r>
-        <w:t xml:space="preserve">22.</w:t>
-      </w:r>
-      <w:r>
-        <w:t xml:space="preserve"> </w:t>
-      </w:r>
-      <w:r>
-        <w:t xml:space="preserve">	</w:t>
-      </w:r>
-      <w:r>
         <w:t xml:space="preserve">Stevens GA, King G, Shibuya K. Deaths from heart failure: Using coarsened exact matching to correct cause-of-death statistics. Population Health Metrics. 2010;8(1):6. doi:</w:t>
       </w:r>
-      <w:hyperlink r:id="rId61">
+      <w:hyperlink r:id="rId66">
         <w:r>
           <w:rPr>
             <w:rStyle w:val="Hyperlink"/>
@@ -2831,14 +3141,14 @@
         </w:r>
       </w:hyperlink>
     </w:p>
-    <w:bookmarkEnd w:id="62"/>
-    <w:bookmarkStart w:id="63" w:name="ref-bierrenbach2019"/>
+    <w:bookmarkEnd w:id="67"/>
+    <w:bookmarkStart w:id="68" w:name="ref-bierrenbach2019"/>
     <w:p>
       <w:pPr>
         <w:pStyle w:val="Bibliography"/>
       </w:pPr>
       <w:r>
-        <w:t xml:space="preserve">23.</w:t>
+        <w:t xml:space="preserve">24.</w:t>
       </w:r>
       <w:r>
         <w:t xml:space="preserve"> </w:t>
@@ -2853,14 +3163,14 @@
         <w:t xml:space="preserve"> Redistribution of heart failure deaths using two methods: Linkage of hospital records with death certificates. Rev Bras Epidemiol. 2019;22(Suppl 3):e190006.</w:t>
       </w:r>
     </w:p>
-    <w:bookmarkEnd w:id="63"/>
-    <w:bookmarkStart w:id="65" w:name="ref-fihel2021"/>
+    <w:bookmarkEnd w:id="68"/>
+    <w:bookmarkStart w:id="70" w:name="ref-fihel2021"/>
     <w:p>
       <w:pPr>
         <w:pStyle w:val="Bibliography"/>
       </w:pPr>
       <w:r>
-        <w:t xml:space="preserve">24.</w:t>
+        <w:t xml:space="preserve">25.</w:t>
       </w:r>
       <w:r>
         <w:t xml:space="preserve"> </w:t>
@@ -2871,7 +3181,7 @@
       <w:r>
         <w:t xml:space="preserve">Fihel A, Muszyńska-Spielauer MM. Using multiple cause of death information to eliminate garbage codes. Demographic Research. 2021;45:345–60. doi:</w:t>
       </w:r>
-      <w:hyperlink r:id="rId64">
+      <w:hyperlink r:id="rId69">
         <w:r>
           <w:rPr>
             <w:rStyle w:val="Hyperlink"/>
@@ -2880,14 +3190,14 @@
         </w:r>
       </w:hyperlink>
     </w:p>
-    <w:bookmarkEnd w:id="65"/>
-    <w:bookmarkStart w:id="66" w:name="ref-grigoriev2024"/>
+    <w:bookmarkEnd w:id="70"/>
+    <w:bookmarkStart w:id="71" w:name="ref-grigoriev2024"/>
     <w:p>
       <w:pPr>
         <w:pStyle w:val="Bibliography"/>
       </w:pPr>
       <w:r>
-        <w:t xml:space="preserve">25.</w:t>
+        <w:t xml:space="preserve">26.</w:t>
       </w:r>
       <w:r>
         <w:t xml:space="preserve"> </w:t>
@@ -2899,14 +3209,14 @@
         <w:t xml:space="preserve">Grigoriev P, Bonnet F, Perdrix E. Method for redistributing ill-defined causes of death. Popul Health Metr. 2024;22(1):1–14.</w:t>
       </w:r>
     </w:p>
-    <w:bookmarkEnd w:id="66"/>
-    <w:bookmarkStart w:id="67" w:name="ref-giraldo2017"/>
+    <w:bookmarkEnd w:id="71"/>
+    <w:bookmarkStart w:id="72" w:name="ref-giraldo2017"/>
     <w:p>
       <w:pPr>
         <w:pStyle w:val="Bibliography"/>
       </w:pPr>
       <w:r>
-        <w:t xml:space="preserve">26.</w:t>
+        <w:t xml:space="preserve">27.</w:t>
       </w:r>
       <w:r>
         <w:t xml:space="preserve"> </w:t>
@@ -2930,14 +3240,14 @@
         <w:t xml:space="preserve">blica. 2017;19(2):166–73.</w:t>
       </w:r>
     </w:p>
-    <w:bookmarkEnd w:id="67"/>
-    <w:bookmarkStart w:id="68" w:name="ref-masquelier2019"/>
+    <w:bookmarkEnd w:id="72"/>
+    <w:bookmarkStart w:id="73" w:name="ref-masquelier2019"/>
     <w:p>
       <w:pPr>
         <w:pStyle w:val="Bibliography"/>
       </w:pPr>
       <w:r>
-        <w:t xml:space="preserve">27.</w:t>
+        <w:t xml:space="preserve">28.</w:t>
       </w:r>
       <w:r>
         <w:t xml:space="preserve"> </w:t>
@@ -2952,14 +3262,14 @@
         <w:t xml:space="preserve"> Analysis of death registers in antananarivo, madagascar. BMC. 2019.</w:t>
       </w:r>
     </w:p>
-    <w:bookmarkEnd w:id="68"/>
-    <w:bookmarkStart w:id="70" w:name="ref-scohy2025"/>
+    <w:bookmarkEnd w:id="73"/>
+    <w:bookmarkStart w:id="75" w:name="ref-scohy2025"/>
     <w:p>
       <w:pPr>
         <w:pStyle w:val="Bibliography"/>
       </w:pPr>
       <w:r>
-        <w:t xml:space="preserve">28.</w:t>
+        <w:t xml:space="preserve">29.</w:t>
       </w:r>
       <w:r>
         <w:t xml:space="preserve"> </w:t>
@@ -2970,7 +3280,7 @@
       <w:r>
         <w:t xml:space="preserve">Scohy A, Lesnik T, Devleesschauwer B, Haneef R. The importance of redistribution process of ill-defined deaths in national mortality database. Archives of Public Health. 2025 Jul 11;83(1):185. doi:</w:t>
       </w:r>
-      <w:hyperlink r:id="rId69">
+      <w:hyperlink r:id="rId74">
         <w:r>
           <w:rPr>
             <w:rStyle w:val="Hyperlink"/>
@@ -2979,14 +3289,14 @@
         </w:r>
       </w:hyperlink>
     </w:p>
-    <w:bookmarkEnd w:id="70"/>
-    <w:bookmarkStart w:id="72" w:name="ref-kyu2021"/>
+    <w:bookmarkEnd w:id="75"/>
+    <w:bookmarkStart w:id="77" w:name="ref-kyu2021"/>
     <w:p>
       <w:pPr>
         <w:pStyle w:val="Bibliography"/>
       </w:pPr>
       <w:r>
-        <w:t xml:space="preserve">29.</w:t>
+        <w:t xml:space="preserve">30.</w:t>
       </w:r>
       <w:r>
         <w:t xml:space="preserve"> </w:t>
@@ -3000,7 +3310,7 @@
       <w:r>
         <w:t xml:space="preserve"> Estimating the burden of HIV/AIDS-related mortality: HIV/AIDS-related garbage code redistribution packages. Journal of the International AIDS Society. 2021. doi:</w:t>
       </w:r>
-      <w:hyperlink r:id="rId71">
+      <w:hyperlink r:id="rId76">
         <w:r>
           <w:rPr>
             <w:rStyle w:val="Hyperlink"/>
@@ -3009,14 +3319,14 @@
         </w:r>
       </w:hyperlink>
     </w:p>
-    <w:bookmarkEnd w:id="72"/>
-    <w:bookmarkStart w:id="74" w:name="ref-zhang2025"/>
+    <w:bookmarkEnd w:id="77"/>
+    <w:bookmarkStart w:id="79" w:name="ref-zhang2025"/>
     <w:p>
       <w:pPr>
         <w:pStyle w:val="Bibliography"/>
       </w:pPr>
       <w:r>
-        <w:t xml:space="preserve">30.</w:t>
+        <w:t xml:space="preserve">31.</w:t>
       </w:r>
       <w:r>
         <w:t xml:space="preserve"> </w:t>
@@ -3027,7 +3337,7 @@
       <w:r>
         <w:t xml:space="preserve">Zhang X, Yang W, Wang J, Ai L, Chen M, Wang C, et al. Reallocating diabetes-related garbage codes to improve mortality estimates: A case study in weifang, china. Population Health Metrics. 2025;23(1):38. doi:</w:t>
       </w:r>
-      <w:hyperlink r:id="rId73">
+      <w:hyperlink r:id="rId78">
         <w:r>
           <w:rPr>
             <w:rStyle w:val="Hyperlink"/>
@@ -3036,14 +3346,14 @@
         </w:r>
       </w:hyperlink>
     </w:p>
-    <w:bookmarkEnd w:id="74"/>
-    <w:bookmarkStart w:id="75" w:name="ref-teixeira2020"/>
+    <w:bookmarkEnd w:id="79"/>
+    <w:bookmarkStart w:id="80" w:name="ref-teixeira2020"/>
     <w:p>
       <w:pPr>
         <w:pStyle w:val="Bibliography"/>
       </w:pPr>
       <w:r>
-        <w:t xml:space="preserve">31.</w:t>
+        <w:t xml:space="preserve">32.</w:t>
       </w:r>
       <w:r>
         <w:t xml:space="preserve"> </w:t>
@@ -3055,14 +3365,14 @@
         <w:t xml:space="preserve">Teixeira B, Toporcov T, Chiaravalloti-Neto F, Chiavegatto Filho A. Spatial clusters of cancer mortality in brazil: A machine learning modelling approach. In: Anexo do curriculo lattes. 2020.</w:t>
       </w:r>
     </w:p>
-    <w:bookmarkEnd w:id="75"/>
-    <w:bookmarkStart w:id="77" w:name="ref-dearaujo2026"/>
+    <w:bookmarkEnd w:id="80"/>
+    <w:bookmarkStart w:id="82" w:name="ref-dearaujo2026"/>
     <w:p>
       <w:pPr>
         <w:pStyle w:val="Bibliography"/>
       </w:pPr>
       <w:r>
-        <w:t xml:space="preserve">32.</w:t>
+        <w:t xml:space="preserve">33.</w:t>
       </w:r>
       <w:r>
         <w:t xml:space="preserve"> </w:t>
@@ -3073,7 +3383,7 @@
       <w:r>
         <w:t xml:space="preserve">Araújo Santos Camargo JD de, Camargo SF, Souza ATB de, Oliveira Freitas AKMS de, Ferreira CA, Sarmento ACA, et al. Regional disparities in breast cancer mortality in brazil: A spatial analysis using uncorrected and adjusted data, 2000–2023. Scientific Reports. 2026;16:6770. doi:</w:t>
       </w:r>
-      <w:hyperlink r:id="rId76">
+      <w:hyperlink r:id="rId81">
         <w:r>
           <w:rPr>
             <w:rStyle w:val="Hyperlink"/>
@@ -3082,14 +3392,14 @@
         </w:r>
       </w:hyperlink>
     </w:p>
-    <w:bookmarkEnd w:id="77"/>
-    <w:bookmarkStart w:id="79" w:name="ref-zimeomorais2023"/>
+    <w:bookmarkEnd w:id="82"/>
+    <w:bookmarkStart w:id="84" w:name="ref-zimeomorais2023"/>
     <w:p>
       <w:pPr>
         <w:pStyle w:val="Bibliography"/>
       </w:pPr>
       <w:r>
-        <w:t xml:space="preserve">33.</w:t>
+        <w:t xml:space="preserve">34.</w:t>
       </w:r>
       <w:r>
         <w:t xml:space="preserve"> </w:t>
@@ -3100,7 +3410,7 @@
       <w:r>
         <w:t xml:space="preserve">Zimeo-Morais GA, Miraglia JL, Oliveira BZ de, Mistro S, Hisatugu WH, Greffin D, et al. Factors associated with the quality of death certification in brazilian municipalities: A data-driven non-linear model. PLoS One. 2023;18(8):e0290814. doi:</w:t>
       </w:r>
-      <w:hyperlink r:id="rId78">
+      <w:hyperlink r:id="rId83">
         <w:r>
           <w:rPr>
             <w:rStyle w:val="Hyperlink"/>
@@ -3109,14 +3419,14 @@
         </w:r>
       </w:hyperlink>
     </w:p>
-    <w:bookmarkEnd w:id="79"/>
-    <w:bookmarkStart w:id="81" w:name="ref-desouza2025"/>
+    <w:bookmarkEnd w:id="84"/>
+    <w:bookmarkStart w:id="86" w:name="ref-desouza2025"/>
     <w:p>
       <w:pPr>
         <w:pStyle w:val="Bibliography"/>
       </w:pPr>
       <w:r>
-        <w:t xml:space="preserve">34.</w:t>
+        <w:t xml:space="preserve">35.</w:t>
       </w:r>
       <w:r>
         <w:t xml:space="preserve"> </w:t>
@@ -3127,7 +3437,7 @@
       <w:r>
         <w:t xml:space="preserve">Souza ARM de, Raposo LM, Lacerda GCB de, Godoy PH. Stroke deaths profile and its subtypes in brazil: Analysis using machine learning. Global Heart. 2025;20(1):85. doi:</w:t>
       </w:r>
-      <w:hyperlink r:id="rId80">
+      <w:hyperlink r:id="rId85">
         <w:r>
           <w:rPr>
             <w:rStyle w:val="Hyperlink"/>
@@ -3136,14 +3446,14 @@
         </w:r>
       </w:hyperlink>
     </w:p>
-    <w:bookmarkEnd w:id="81"/>
-    <w:bookmarkStart w:id="82" w:name="ref-mikkelsen2015"/>
+    <w:bookmarkEnd w:id="86"/>
+    <w:bookmarkStart w:id="87" w:name="ref-mikkelsen2015"/>
     <w:p>
       <w:pPr>
         <w:pStyle w:val="Bibliography"/>
       </w:pPr>
       <w:r>
-        <w:t xml:space="preserve">35.</w:t>
+        <w:t xml:space="preserve">36.</w:t>
       </w:r>
       <w:r>
         <w:t xml:space="preserve"> </w:t>
@@ -3158,14 +3468,14 @@
         <w:t xml:space="preserve"> A global assessment of civil registration and vital statistics systems: Monitoring data quality and progress. Lancet. 2015;386:1395–406.</w:t>
       </w:r>
     </w:p>
-    <w:bookmarkEnd w:id="82"/>
-    <w:bookmarkStart w:id="84" w:name="ref-mikkelsen2020"/>
+    <w:bookmarkEnd w:id="87"/>
+    <w:bookmarkStart w:id="89" w:name="ref-mikkelsen2020"/>
     <w:p>
       <w:pPr>
         <w:pStyle w:val="Bibliography"/>
       </w:pPr>
       <w:r>
-        <w:t xml:space="preserve">36.</w:t>
+        <w:t xml:space="preserve">37.</w:t>
       </w:r>
       <w:r>
         <w:t xml:space="preserve"> </w:t>
@@ -3176,7 +3486,7 @@
       <w:r>
         <w:t xml:space="preserve">Mikkelsen L, Moesgaard K, Hegnauer M, Lopez AD. ANACONDA: A new tool to improve mortality and cause of death data. BMC Medicine. 2020;18(1):61. doi:</w:t>
       </w:r>
-      <w:hyperlink r:id="rId83">
+      <w:hyperlink r:id="rId88">
         <w:r>
           <w:rPr>
             <w:rStyle w:val="Hyperlink"/>
@@ -3185,14 +3495,14 @@
         </w:r>
       </w:hyperlink>
     </w:p>
-    <w:bookmarkEnd w:id="84"/>
-    <w:bookmarkStart w:id="86" w:name="ref-devleesschauwer2022"/>
+    <w:bookmarkEnd w:id="89"/>
+    <w:bookmarkStart w:id="91" w:name="ref-devleesschauwer2022"/>
     <w:p>
       <w:pPr>
         <w:pStyle w:val="Bibliography"/>
       </w:pPr>
       <w:r>
-        <w:t xml:space="preserve">37.</w:t>
+        <w:t xml:space="preserve">38.</w:t>
       </w:r>
       <w:r>
         <w:t xml:space="preserve"> </w:t>
@@ -3203,7 +3513,7 @@
       <w:r>
         <w:t xml:space="preserve">Devleesschauwer B. Skills building seminar: Redistribution of ill-defined deaths: A methodological conundrum. In: European journal of public health. Oxford University Press; 2022. p. ckac129–618. doi:</w:t>
       </w:r>
-      <w:hyperlink r:id="rId85">
+      <w:hyperlink r:id="rId90">
         <w:r>
           <w:rPr>
             <w:rStyle w:val="Hyperlink"/>
@@ -3212,14 +3522,14 @@
         </w:r>
       </w:hyperlink>
     </w:p>
-    <w:bookmarkEnd w:id="86"/>
-    <w:bookmarkStart w:id="87" w:name="ref-ng2020"/>
+    <w:bookmarkEnd w:id="91"/>
+    <w:bookmarkStart w:id="92" w:name="ref-ng2020"/>
     <w:p>
       <w:pPr>
         <w:pStyle w:val="Bibliography"/>
       </w:pPr>
       <w:r>
-        <w:t xml:space="preserve">38.</w:t>
+        <w:t xml:space="preserve">39.</w:t>
       </w:r>
       <w:r>
         <w:t xml:space="preserve"> </w:t>
@@ -3231,14 +3541,14 @@
         <w:t xml:space="preserve">Ng TC, Lo WC, Ku CC, Lu TH, Lin HH. Improving the use of mortality data in public health: A comparison of garbage code redistribution models. American Journal of Public Health. 2020;110(2):222–9.</w:t>
       </w:r>
     </w:p>
-    <w:bookmarkEnd w:id="87"/>
-    <w:bookmarkStart w:id="89" w:name="ref-chrysanthopoulou2021"/>
+    <w:bookmarkEnd w:id="92"/>
+    <w:bookmarkStart w:id="94" w:name="ref-chrysanthopoulou2021"/>
     <w:p>
       <w:pPr>
         <w:pStyle w:val="Bibliography"/>
       </w:pPr>
       <w:r>
-        <w:t xml:space="preserve">39.</w:t>
+        <w:t xml:space="preserve">40.</w:t>
       </w:r>
       <w:r>
         <w:t xml:space="preserve"> </w:t>
@@ -3249,7 +3559,7 @@
       <w:r>
         <w:t xml:space="preserve">Chrysanthopoulou SA, Rutter CM, Gatsonis CA. Bayesian versus empirical calibration of microsimulation models: A comparative analysis. Medical Decision Making. 2021 Aug;41(6):714–26. doi:</w:t>
       </w:r>
-      <w:hyperlink r:id="rId88">
+      <w:hyperlink r:id="rId93">
         <w:r>
           <w:rPr>
             <w:rStyle w:val="Hyperlink"/>
@@ -3258,14 +3568,14 @@
         </w:r>
       </w:hyperlink>
     </w:p>
-    <w:bookmarkEnd w:id="89"/>
-    <w:bookmarkStart w:id="90" w:name="ref-costa2020"/>
+    <w:bookmarkEnd w:id="94"/>
+    <w:bookmarkStart w:id="95" w:name="ref-costa2020"/>
     <w:p>
       <w:pPr>
         <w:pStyle w:val="Bibliography"/>
       </w:pPr>
       <w:r>
-        <w:t xml:space="preserve">40.</w:t>
+        <w:t xml:space="preserve">41.</w:t>
       </w:r>
       <w:r>
         <w:t xml:space="preserve"> </w:t>
@@ -3277,14 +3587,14 @@
         <w:t xml:space="preserve">Costa LFL, Montenegro M de MS, Rabello Neto D de L, Oliveira ATR de, Trindade JE de O, Adair T, et al. Estimating completeness of national and subnational death reporting in brazil: Application of record linkage methods. Population Health Metrics. 2020;18(1):22.</w:t>
       </w:r>
     </w:p>
-    <w:bookmarkEnd w:id="90"/>
-    <w:bookmarkStart w:id="92" w:name="ref-foreman2018"/>
+    <w:bookmarkEnd w:id="95"/>
+    <w:bookmarkStart w:id="97" w:name="ref-foreman2018"/>
     <w:p>
       <w:pPr>
         <w:pStyle w:val="Bibliography"/>
       </w:pPr>
       <w:r>
-        <w:t xml:space="preserve">41.</w:t>
+        <w:t xml:space="preserve">42.</w:t>
       </w:r>
       <w:r>
         <w:t xml:space="preserve"> </w:t>
@@ -3298,7 +3608,7 @@
       <w:r>
         <w:t xml:space="preserve">40 for 195 countries and territories. The Lancet. 2018;392(10159):2052–90. doi:</w:t>
       </w:r>
-      <w:hyperlink r:id="rId91">
+      <w:hyperlink r:id="rId96">
         <w:r>
           <w:rPr>
             <w:rStyle w:val="Hyperlink"/>
@@ -3307,14 +3617,14 @@
         </w:r>
       </w:hyperlink>
     </w:p>
-    <w:bookmarkEnd w:id="92"/>
-    <w:bookmarkStart w:id="94" w:name="ref-malta2023"/>
+    <w:bookmarkEnd w:id="97"/>
+    <w:bookmarkStart w:id="99" w:name="ref-malta2023"/>
     <w:p>
       <w:pPr>
         <w:pStyle w:val="Bibliography"/>
       </w:pPr>
       <w:r>
-        <w:t xml:space="preserve">42.</w:t>
+        <w:t xml:space="preserve">43.</w:t>
       </w:r>
       <w:r>
         <w:t xml:space="preserve"> </w:t>
@@ -3325,7 +3635,7 @@
       <w:r>
         <w:t xml:space="preserve">Malta DC, Teixeira RA, Cardoso LS de M, Souza JB de, Bernal RTI, Pinheiro PC, et al. Premature mortality due to noncommunicable diseases in brazilian capitals: Redistribution of garbage causes and evolution by social deprivation strata. Revista Brasileira de Epidemiologia. 2023;26:e230002.supl.1. doi:</w:t>
       </w:r>
-      <w:hyperlink r:id="rId93">
+      <w:hyperlink r:id="rId98">
         <w:r>
           <w:rPr>
             <w:rStyle w:val="Hyperlink"/>
@@ -3334,14 +3644,14 @@
         </w:r>
       </w:hyperlink>
     </w:p>
-    <w:bookmarkEnd w:id="94"/>
-    <w:bookmarkStart w:id="96" w:name="ref-liu2022"/>
+    <w:bookmarkEnd w:id="99"/>
+    <w:bookmarkStart w:id="101" w:name="ref-liu2022"/>
     <w:p>
       <w:pPr>
         <w:pStyle w:val="Bibliography"/>
       </w:pPr>
       <w:r>
-        <w:t xml:space="preserve">43.</w:t>
+        <w:t xml:space="preserve">44.</w:t>
       </w:r>
       <w:r>
         <w:t xml:space="preserve"> </w:t>
@@ -3352,7 +3662,7 @@
       <w:r>
         <w:t xml:space="preserve">Liu L, Wang X, Wang C, Ma X, Meng X, Ning B, et al. A study on garbage code redistribution methods in small area: Redistributing heart failure in two chinese cities by two approaches. Research Square (Preprint). 2022. doi:</w:t>
       </w:r>
-      <w:hyperlink r:id="rId95">
+      <w:hyperlink r:id="rId100">
         <w:r>
           <w:rPr>
             <w:rStyle w:val="Hyperlink"/>
@@ -3361,14 +3671,14 @@
         </w:r>
       </w:hyperlink>
     </w:p>
-    <w:bookmarkEnd w:id="96"/>
-    <w:bookmarkStart w:id="97" w:name="ref-wickham2016"/>
+    <w:bookmarkEnd w:id="101"/>
+    <w:bookmarkStart w:id="102" w:name="ref-wickham2016"/>
     <w:p>
       <w:pPr>
         <w:pStyle w:val="Bibliography"/>
       </w:pPr>
       <w:r>
-        <w:t xml:space="preserve">44.</w:t>
+        <w:t xml:space="preserve">45.</w:t>
       </w:r>
       <w:r>
         <w:t xml:space="preserve"> </w:t>
@@ -3380,14 +3690,14 @@
         <w:t xml:space="preserve">Wickham H. ggplot2: Elegant graphics for data analysis. New York: Springer-Verlag; 2016.</w:t>
       </w:r>
     </w:p>
-    <w:bookmarkEnd w:id="97"/>
-    <w:bookmarkStart w:id="98" w:name="ref-csardi2006"/>
+    <w:bookmarkEnd w:id="102"/>
+    <w:bookmarkStart w:id="103" w:name="ref-csardi2006"/>
     <w:p>
       <w:pPr>
         <w:pStyle w:val="Bibliography"/>
       </w:pPr>
       <w:r>
-        <w:t xml:space="preserve">45.</w:t>
+        <w:t xml:space="preserve">46.</w:t>
       </w:r>
       <w:r>
         <w:t xml:space="preserve"> </w:t>
@@ -3399,8 +3709,8 @@
         <w:t xml:space="preserve">Csardi G, Nepusz T. The igraph software package for complex network research. InterJournal, Complex Systems. 2006;1695:1–9.</w:t>
       </w:r>
     </w:p>
-    <w:bookmarkEnd w:id="98"/>
-    <w:bookmarkEnd w:id="99"/>
+    <w:bookmarkEnd w:id="103"/>
+    <w:bookmarkEnd w:id="104"/>
     <w:p>
       <w:r>
         <w:pict>
@@ -3408,8 +3718,8 @@
         </w:pict>
       </w:r>
     </w:p>
-    <w:bookmarkEnd w:id="100"/>
-    <w:bookmarkStart w:id="103" w:name="appendices"/>
+    <w:bookmarkEnd w:id="105"/>
+    <w:bookmarkStart w:id="109" w:name="appendices"/>
     <w:p>
       <w:pPr>
         <w:pStyle w:val="Heading1"/>
@@ -3418,7 +3728,7 @@
         <w:rPr>
           <w:rStyle w:val="SectionNumber"/>
         </w:rPr>
-        <w:t xml:space="preserve">6</w:t>
+        <w:t xml:space="preserve">10</w:t>
       </w:r>
       <w:r>
         <w:tab/>
@@ -3427,7 +3737,7 @@
         <w:t xml:space="preserve">Appendices</w:t>
       </w:r>
     </w:p>
-    <w:bookmarkStart w:id="101" w:name="appendix-i-search-strategy"/>
+    <w:bookmarkStart w:id="106" w:name="appendix-i-search-strategy"/>
     <w:p>
       <w:pPr>
         <w:pStyle w:val="Heading2"/>
@@ -3436,7 +3746,7 @@
         <w:rPr>
           <w:rStyle w:val="SectionNumber"/>
         </w:rPr>
-        <w:t xml:space="preserve">6.1</w:t>
+        <w:t xml:space="preserve">10.1</w:t>
       </w:r>
       <w:r>
         <w:tab/>
@@ -4182,8 +4492,8 @@
         </w:tc>
       </w:tr>
     </w:tbl>
-    <w:bookmarkEnd w:id="101"/>
-    <w:bookmarkStart w:id="102" w:name="appendix-ii-data-extraction-instrument"/>
+    <w:bookmarkEnd w:id="106"/>
+    <w:bookmarkStart w:id="107" w:name="appendix-ii-data-extraction-instrument"/>
     <w:p>
       <w:pPr>
         <w:pStyle w:val="Heading2"/>
@@ -4192,7 +4502,7 @@
         <w:rPr>
           <w:rStyle w:val="SectionNumber"/>
         </w:rPr>
-        <w:t xml:space="preserve">6.2</w:t>
+        <w:t xml:space="preserve">10.2</w:t>
       </w:r>
       <w:r>
         <w:tab/>
@@ -5340,8 +5650,1139 @@
         </w:tc>
       </w:tr>
     </w:tbl>
-    <w:bookmarkEnd w:id="102"/>
-    <w:bookmarkEnd w:id="103"/>
+    <w:bookmarkEnd w:id="107"/>
+    <w:bookmarkStart w:id="108" w:name="X71c3791fa8d711dc53f1fbd0b2c35a1190e5b49"/>
+    <w:p>
+      <w:pPr>
+        <w:pStyle w:val="Heading2"/>
+      </w:pPr>
+      <w:r>
+        <w:rPr>
+          <w:rStyle w:val="SectionNumber"/>
+        </w:rPr>
+        <w:t xml:space="preserve">10.3</w:t>
+      </w:r>
+      <w:r>
+        <w:tab/>
+      </w:r>
+      <w:r>
+        <w:t xml:space="preserve">Appendix III: PRISMA-S Audit and Mapping Table</w:t>
+      </w:r>
+    </w:p>
+    <w:p>
+      <w:pPr>
+        <w:pStyle w:val="FirstParagraph"/>
+      </w:pPr>
+      <w:r>
+        <w:t xml:space="preserve">The following table details the adherence to the 16 items of the PRISMA-S guideline for the scoping review protocol entitled</w:t>
+      </w:r>
+      <w:r>
+        <w:t xml:space="preserve"> </w:t>
+      </w:r>
+      <w:r>
+        <w:rPr>
+          <w:i/>
+          <w:iCs/>
+        </w:rPr>
+        <w:t xml:space="preserve">“Methodologies for the correction of Garbage codes in mortality records and their applicability in microsimulation models”</w:t>
+      </w:r>
+      <w:r>
+        <w:t xml:space="preserve">, ensuring complete search auditability, transparency, and computational reproducibility.</w:t>
+      </w:r>
+    </w:p>
+    <w:tbl>
+      <w:tblPr>
+        <w:tblStyle w:val="Table"/>
+        <w:tblW w:type="pct" w:w="5000"/>
+        <w:tblLayout w:type="fixed"/>
+        <w:tblLook w:firstRow="1" w:lastRow="0" w:firstColumn="0" w:lastColumn="0" w:noHBand="0" w:noVBand="0" w:val="0020"/>
+      </w:tblPr>
+      <w:tblGrid>
+        <w:gridCol w:w="1980"/>
+        <w:gridCol w:w="1980"/>
+        <w:gridCol w:w="1980"/>
+        <w:gridCol w:w="1980"/>
+      </w:tblGrid>
+      <w:tr>
+        <w:trPr>
+          <w:tblHeader w:val="on"/>
+        </w:trPr>
+        <w:tc>
+          <w:tcPr/>
+          <w:p>
+            <w:pPr>
+              <w:pStyle w:val="Compact"/>
+              <w:jc w:val="left"/>
+            </w:pPr>
+            <w:r>
+              <w:t xml:space="preserve">PRISMA-S Item</w:t>
+            </w:r>
+          </w:p>
+        </w:tc>
+        <w:tc>
+          <w:tcPr/>
+          <w:p>
+            <w:pPr>
+              <w:pStyle w:val="Compact"/>
+              <w:jc w:val="left"/>
+            </w:pPr>
+            <w:r>
+              <w:t xml:space="preserve">Reporting Requirement</w:t>
+            </w:r>
+          </w:p>
+        </w:tc>
+        <w:tc>
+          <w:tcPr/>
+          <w:p>
+            <w:pPr>
+              <w:pStyle w:val="Compact"/>
+              <w:jc w:val="left"/>
+            </w:pPr>
+            <w:r>
+              <w:t xml:space="preserve">Specific Implementation in Protocol &amp; R Pipeline</w:t>
+            </w:r>
+          </w:p>
+        </w:tc>
+        <w:tc>
+          <w:tcPr/>
+          <w:p>
+            <w:pPr>
+              <w:pStyle w:val="Compact"/>
+              <w:jc w:val="left"/>
+            </w:pPr>
+            <w:r>
+              <w:t xml:space="preserve">Location / Status</w:t>
+            </w:r>
+          </w:p>
+        </w:tc>
+      </w:tr>
+      <w:tr>
+        <w:tc>
+          <w:tcPr/>
+          <w:p>
+            <w:pPr>
+              <w:pStyle w:val="Compact"/>
+              <w:jc w:val="left"/>
+            </w:pPr>
+            <w:r>
+              <w:rPr>
+                <w:b/>
+                <w:bCs/>
+              </w:rPr>
+              <w:t xml:space="preserve">1. Information sources</w:t>
+            </w:r>
+          </w:p>
+        </w:tc>
+        <w:tc>
+          <w:tcPr/>
+          <w:p>
+            <w:pPr>
+              <w:pStyle w:val="Compact"/>
+              <w:jc w:val="left"/>
+            </w:pPr>
+            <w:r>
+              <w:t xml:space="preserve">Describe all information sources consulted (databases, registries, websites, grey literature).</w:t>
+            </w:r>
+          </w:p>
+        </w:tc>
+        <w:tc>
+          <w:tcPr/>
+          <w:p>
+            <w:pPr>
+              <w:pStyle w:val="Compact"/>
+              <w:jc w:val="left"/>
+            </w:pPr>
+            <w:r>
+              <w:t xml:space="preserve">Indexed databases: PubMed/MEDLINE, Scopus, Web of Science, LILACS, and SciELO. Institutional grey literature: WHO, PAHO, IHME, and MINSAL. Specialized grey repositories: CADTH GreyMatters, BASE, and OpenGrey.</w:t>
+            </w:r>
+          </w:p>
+        </w:tc>
+        <w:tc>
+          <w:tcPr/>
+          <w:p>
+            <w:pPr>
+              <w:pStyle w:val="Compact"/>
+              <w:jc w:val="left"/>
+            </w:pPr>
+            <w:r>
+              <w:t xml:space="preserve">Section 3.1 &amp; Section 3.2</w:t>
+            </w:r>
+          </w:p>
+        </w:tc>
+      </w:tr>
+      <w:tr>
+        <w:tc>
+          <w:tcPr/>
+          <w:p>
+            <w:pPr>
+              <w:pStyle w:val="Compact"/>
+              <w:jc w:val="left"/>
+            </w:pPr>
+            <w:r>
+              <w:rPr>
+                <w:b/>
+                <w:bCs/>
+              </w:rPr>
+              <w:t xml:space="preserve">2. Electronic search strategy</w:t>
+            </w:r>
+          </w:p>
+        </w:tc>
+        <w:tc>
+          <w:tcPr/>
+          <w:p>
+            <w:pPr>
+              <w:pStyle w:val="Compact"/>
+              <w:jc w:val="left"/>
+            </w:pPr>
+            <w:r>
+              <w:t xml:space="preserve">Present the full electronic search strategy for at least one major database, including syntax and operators.</w:t>
+            </w:r>
+          </w:p>
+        </w:tc>
+        <w:tc>
+          <w:tcPr/>
+          <w:p>
+            <w:pPr>
+              <w:pStyle w:val="Compact"/>
+              <w:jc w:val="left"/>
+            </w:pPr>
+            <w:r>
+              <w:t xml:space="preserve">Complete search query designed for MEDLINE (via Ovid) structured under the Population, Concept, and Context (PCC) framework.</w:t>
+            </w:r>
+          </w:p>
+        </w:tc>
+        <w:tc>
+          <w:tcPr/>
+          <w:p>
+            <w:pPr>
+              <w:pStyle w:val="Compact"/>
+              <w:jc w:val="left"/>
+            </w:pPr>
+            <w:r>
+              <w:t xml:space="preserve">Section 6.1 (Appendix I)</w:t>
+            </w:r>
+          </w:p>
+        </w:tc>
+      </w:tr>
+      <w:tr>
+        <w:tc>
+          <w:tcPr/>
+          <w:p>
+            <w:pPr>
+              <w:pStyle w:val="Compact"/>
+              <w:jc w:val="left"/>
+            </w:pPr>
+            <w:r>
+              <w:rPr>
+                <w:b/>
+                <w:bCs/>
+              </w:rPr>
+              <w:t xml:space="preserve">3. Database platforms and vendors</w:t>
+            </w:r>
+          </w:p>
+        </w:tc>
+        <w:tc>
+          <w:tcPr/>
+          <w:p>
+            <w:pPr>
+              <w:pStyle w:val="Compact"/>
+              <w:jc w:val="left"/>
+            </w:pPr>
+            <w:r>
+              <w:t xml:space="preserve">Specify the database platforms or interface vendors used for each search.</w:t>
+            </w:r>
+          </w:p>
+        </w:tc>
+        <w:tc>
+          <w:tcPr/>
+          <w:p>
+            <w:pPr>
+              <w:pStyle w:val="Compact"/>
+              <w:jc w:val="left"/>
+            </w:pPr>
+            <w:r>
+              <w:t xml:space="preserve">Programmatic querying via Application APIs and specialized R libraries (</w:t>
+            </w:r>
+            <w:r>
+              <w:rPr>
+                <w:rStyle w:val="VerbatimChar"/>
+              </w:rPr>
+              <w:t xml:space="preserve">rentrez</w:t>
+            </w:r>
+            <w:r>
+              <w:t xml:space="preserve"> </w:t>
+            </w:r>
+            <w:r>
+              <w:t xml:space="preserve">for PubMed,</w:t>
+            </w:r>
+            <w:r>
+              <w:t xml:space="preserve"> </w:t>
+            </w:r>
+            <w:r>
+              <w:rPr>
+                <w:rStyle w:val="VerbatimChar"/>
+              </w:rPr>
+              <w:t xml:space="preserve">rscopus</w:t>
+            </w:r>
+            <w:r>
+              <w:t xml:space="preserve"> </w:t>
+            </w:r>
+            <w:r>
+              <w:t xml:space="preserve">for Scopus) and Ovid interface for MEDLINE.</w:t>
+            </w:r>
+          </w:p>
+        </w:tc>
+        <w:tc>
+          <w:tcPr/>
+          <w:p>
+            <w:pPr>
+              <w:pStyle w:val="Compact"/>
+              <w:jc w:val="left"/>
+            </w:pPr>
+            <w:r>
+              <w:t xml:space="preserve">Section 3.2</w:t>
+            </w:r>
+          </w:p>
+        </w:tc>
+      </w:tr>
+      <w:tr>
+        <w:tc>
+          <w:tcPr/>
+          <w:p>
+            <w:pPr>
+              <w:pStyle w:val="Compact"/>
+              <w:jc w:val="left"/>
+            </w:pPr>
+            <w:r>
+              <w:rPr>
+                <w:b/>
+                <w:bCs/>
+              </w:rPr>
+              <w:t xml:space="preserve">4. Translation of search strategy</w:t>
+            </w:r>
+          </w:p>
+        </w:tc>
+        <w:tc>
+          <w:tcPr/>
+          <w:p>
+            <w:pPr>
+              <w:pStyle w:val="Compact"/>
+              <w:jc w:val="left"/>
+            </w:pPr>
+            <w:r>
+              <w:t xml:space="preserve">Describe how the search strategy was adapted for different thesauri and syntaxes.</w:t>
+            </w:r>
+          </w:p>
+        </w:tc>
+        <w:tc>
+          <w:tcPr/>
+          <w:p>
+            <w:pPr>
+              <w:pStyle w:val="Compact"/>
+              <w:jc w:val="left"/>
+            </w:pPr>
+            <w:r>
+              <w:t xml:space="preserve">Adaptation of MeSH descriptors and free-text terms optimized via term co-occurrence networks using the</w:t>
+            </w:r>
+            <w:r>
+              <w:t xml:space="preserve"> </w:t>
+            </w:r>
+            <w:r>
+              <w:rPr>
+                <w:rStyle w:val="VerbatimChar"/>
+              </w:rPr>
+              <w:t xml:space="preserve">litsearchr</w:t>
+            </w:r>
+            <w:r>
+              <w:t xml:space="preserve"> </w:t>
+            </w:r>
+            <w:r>
+              <w:t xml:space="preserve">package in R.</w:t>
+            </w:r>
+          </w:p>
+        </w:tc>
+        <w:tc>
+          <w:tcPr/>
+          <w:p>
+            <w:pPr>
+              <w:pStyle w:val="Compact"/>
+              <w:jc w:val="left"/>
+            </w:pPr>
+            <w:r>
+              <w:t xml:space="preserve">Section 3.2</w:t>
+            </w:r>
+          </w:p>
+        </w:tc>
+      </w:tr>
+      <w:tr>
+        <w:tc>
+          <w:tcPr/>
+          <w:p>
+            <w:pPr>
+              <w:pStyle w:val="Compact"/>
+              <w:jc w:val="left"/>
+            </w:pPr>
+            <w:r>
+              <w:rPr>
+                <w:b/>
+                <w:bCs/>
+              </w:rPr>
+              <w:t xml:space="preserve">5. Limits and restrictions</w:t>
+            </w:r>
+          </w:p>
+        </w:tc>
+        <w:tc>
+          <w:tcPr/>
+          <w:p>
+            <w:pPr>
+              <w:pStyle w:val="Compact"/>
+              <w:jc w:val="left"/>
+            </w:pPr>
+            <w:r>
+              <w:t xml:space="preserve">Specify any search-level restrictions applied (dates, languages, document types).</w:t>
+            </w:r>
+          </w:p>
+        </w:tc>
+        <w:tc>
+          <w:tcPr/>
+          <w:p>
+            <w:pPr>
+              <w:pStyle w:val="Compact"/>
+              <w:jc w:val="left"/>
+            </w:pPr>
+            <w:r>
+              <w:t xml:space="preserve">Temporal restriction from 1996 onwards (marking global ICD-10 implementation and consolidation). No initial language restrictions (English, Spanish, Portuguese).</w:t>
+            </w:r>
+          </w:p>
+        </w:tc>
+        <w:tc>
+          <w:tcPr/>
+          <w:p>
+            <w:pPr>
+              <w:pStyle w:val="Compact"/>
+              <w:jc w:val="left"/>
+            </w:pPr>
+            <w:r>
+              <w:t xml:space="preserve">Section 2.4 &amp; Section 6.1</w:t>
+            </w:r>
+          </w:p>
+        </w:tc>
+      </w:tr>
+      <w:tr>
+        <w:tc>
+          <w:tcPr/>
+          <w:p>
+            <w:pPr>
+              <w:pStyle w:val="Compact"/>
+              <w:jc w:val="left"/>
+            </w:pPr>
+            <w:r>
+              <w:rPr>
+                <w:b/>
+                <w:bCs/>
+              </w:rPr>
+              <w:t xml:space="preserve">6. Search dates</w:t>
+            </w:r>
+          </w:p>
+        </w:tc>
+        <w:tc>
+          <w:tcPr/>
+          <w:p>
+            <w:pPr>
+              <w:pStyle w:val="Compact"/>
+              <w:jc w:val="left"/>
+            </w:pPr>
+            <w:r>
+              <w:t xml:space="preserve">Indicate the exact date when searches were executed or scheduled for each source.</w:t>
+            </w:r>
+          </w:p>
+        </w:tc>
+        <w:tc>
+          <w:tcPr/>
+          <w:p>
+            <w:pPr>
+              <w:pStyle w:val="Compact"/>
+              <w:jc w:val="left"/>
+            </w:pPr>
+            <w:r>
+              <w:t xml:space="preserve">Primary literature search scheduled</w:t>
+            </w:r>
+            <w:r>
+              <w:t xml:space="preserve"> </w:t>
+            </w:r>
+            <w:r>
+              <w:rPr>
+                <w:i/>
+                <w:iCs/>
+              </w:rPr>
+              <w:t xml:space="preserve">a priori</w:t>
+            </w:r>
+            <w:r>
+              <w:t xml:space="preserve"> </w:t>
+            </w:r>
+            <w:r>
+              <w:t xml:space="preserve">for</w:t>
+            </w:r>
+            <w:r>
+              <w:t xml:space="preserve"> </w:t>
+            </w:r>
+            <w:r>
+              <w:rPr>
+                <w:b/>
+                <w:bCs/>
+              </w:rPr>
+              <w:t xml:space="preserve">September 2026</w:t>
+            </w:r>
+            <w:r>
+              <w:t xml:space="preserve">, with a final verification re-run prior to synthesis.</w:t>
+            </w:r>
+          </w:p>
+        </w:tc>
+        <w:tc>
+          <w:tcPr/>
+          <w:p>
+            <w:pPr>
+              <w:pStyle w:val="Compact"/>
+              <w:jc w:val="left"/>
+            </w:pPr>
+            <w:r>
+              <w:t xml:space="preserve">Section 3.1 &amp; Section 6.1</w:t>
+            </w:r>
+          </w:p>
+        </w:tc>
+      </w:tr>
+      <w:tr>
+        <w:tc>
+          <w:tcPr/>
+          <w:p>
+            <w:pPr>
+              <w:pStyle w:val="Compact"/>
+              <w:jc w:val="left"/>
+            </w:pPr>
+            <w:r>
+              <w:rPr>
+                <w:b/>
+                <w:bCs/>
+              </w:rPr>
+              <w:t xml:space="preserve">7. Contacting authors</w:t>
+            </w:r>
+          </w:p>
+        </w:tc>
+        <w:tc>
+          <w:tcPr/>
+          <w:p>
+            <w:pPr>
+              <w:pStyle w:val="Compact"/>
+              <w:jc w:val="left"/>
+            </w:pPr>
+            <w:r>
+              <w:t xml:space="preserve">Indicate if study authors, experts, or key researchers were contacted to identify unpublished studies.</w:t>
+            </w:r>
+          </w:p>
+        </w:tc>
+        <w:tc>
+          <w:tcPr/>
+          <w:p>
+            <w:pPr>
+              <w:pStyle w:val="Compact"/>
+              <w:jc w:val="left"/>
+            </w:pPr>
+            <w:r>
+              <w:t xml:space="preserve">Planned consultations with vital statistics epidemiologists, public health officials, and key regional collaborators in Latin America.</w:t>
+            </w:r>
+          </w:p>
+        </w:tc>
+        <w:tc>
+          <w:tcPr/>
+          <w:p>
+            <w:pPr>
+              <w:pStyle w:val="Compact"/>
+              <w:jc w:val="left"/>
+            </w:pPr>
+            <w:r>
+              <w:t xml:space="preserve">Section 3.1</w:t>
+            </w:r>
+          </w:p>
+        </w:tc>
+      </w:tr>
+      <w:tr>
+        <w:tc>
+          <w:tcPr/>
+          <w:p>
+            <w:pPr>
+              <w:pStyle w:val="Compact"/>
+              <w:jc w:val="left"/>
+            </w:pPr>
+            <w:r>
+              <w:rPr>
+                <w:b/>
+                <w:bCs/>
+              </w:rPr>
+              <w:t xml:space="preserve">8. Registration</w:t>
+            </w:r>
+          </w:p>
+        </w:tc>
+        <w:tc>
+          <w:tcPr/>
+          <w:p>
+            <w:pPr>
+              <w:pStyle w:val="Compact"/>
+              <w:jc w:val="left"/>
+            </w:pPr>
+            <w:r>
+              <w:t xml:space="preserve">Cite the</w:t>
+            </w:r>
+            <w:r>
+              <w:t xml:space="preserve"> </w:t>
+            </w:r>
+            <w:r>
+              <w:rPr>
+                <w:i/>
+                <w:iCs/>
+              </w:rPr>
+              <w:t xml:space="preserve">a priori</w:t>
+            </w:r>
+            <w:r>
+              <w:t xml:space="preserve"> </w:t>
+            </w:r>
+            <w:r>
+              <w:t xml:space="preserve">protocol registration and registry platform used.</w:t>
+            </w:r>
+          </w:p>
+        </w:tc>
+        <w:tc>
+          <w:tcPr/>
+          <w:p>
+            <w:pPr>
+              <w:pStyle w:val="Compact"/>
+              <w:jc w:val="left"/>
+            </w:pPr>
+            <w:r>
+              <w:t xml:space="preserve">Registered</w:t>
+            </w:r>
+            <w:r>
+              <w:t xml:space="preserve"> </w:t>
+            </w:r>
+            <w:r>
+              <w:rPr>
+                <w:i/>
+                <w:iCs/>
+              </w:rPr>
+              <w:t xml:space="preserve">a priori</w:t>
+            </w:r>
+            <w:r>
+              <w:t xml:space="preserve"> </w:t>
+            </w:r>
+            <w:r>
+              <w:t xml:space="preserve">on the</w:t>
+            </w:r>
+            <w:r>
+              <w:t xml:space="preserve"> </w:t>
+            </w:r>
+            <w:r>
+              <w:rPr>
+                <w:b/>
+                <w:bCs/>
+              </w:rPr>
+              <w:t xml:space="preserve">Open Science Framework (OSF)</w:t>
+            </w:r>
+            <w:r>
+              <w:t xml:space="preserve">.</w:t>
+            </w:r>
+          </w:p>
+        </w:tc>
+        <w:tc>
+          <w:tcPr/>
+          <w:p>
+            <w:pPr>
+              <w:pStyle w:val="Compact"/>
+              <w:jc w:val="left"/>
+            </w:pPr>
+            <w:r>
+              <w:t xml:space="preserve">Introduction &amp; Section 3.3</w:t>
+            </w:r>
+          </w:p>
+        </w:tc>
+      </w:tr>
+      <w:tr>
+        <w:tc>
+          <w:tcPr/>
+          <w:p>
+            <w:pPr>
+              <w:pStyle w:val="Compact"/>
+              <w:jc w:val="left"/>
+            </w:pPr>
+            <w:r>
+              <w:rPr>
+                <w:b/>
+                <w:bCs/>
+              </w:rPr>
+              <w:t xml:space="preserve">9. Supplementary searches (Citation searching)</w:t>
+            </w:r>
+          </w:p>
+        </w:tc>
+        <w:tc>
+          <w:tcPr/>
+          <w:p>
+            <w:pPr>
+              <w:pStyle w:val="Compact"/>
+              <w:jc w:val="left"/>
+            </w:pPr>
+            <w:r>
+              <w:t xml:space="preserve">Describe supplementary search methods (backward and forward citation tracking).</w:t>
+            </w:r>
+          </w:p>
+        </w:tc>
+        <w:tc>
+          <w:tcPr/>
+          <w:p>
+            <w:pPr>
+              <w:pStyle w:val="Compact"/>
+              <w:jc w:val="left"/>
+            </w:pPr>
+            <w:r>
+              <w:t xml:space="preserve">Manual backward citation tracking (</w:t>
+            </w:r>
+            <w:r>
+              <w:rPr>
+                <w:i/>
+                <w:iCs/>
+              </w:rPr>
+              <w:t xml:space="preserve">backwards citation searching</w:t>
+            </w:r>
+            <w:r>
+              <w:t xml:space="preserve">) on all studies selected for full-text extraction.</w:t>
+            </w:r>
+          </w:p>
+        </w:tc>
+        <w:tc>
+          <w:tcPr/>
+          <w:p>
+            <w:pPr>
+              <w:pStyle w:val="Compact"/>
+              <w:jc w:val="left"/>
+            </w:pPr>
+            <w:r>
+              <w:t xml:space="preserve">Section 3.1</w:t>
+            </w:r>
+          </w:p>
+        </w:tc>
+      </w:tr>
+      <w:tr>
+        <w:tc>
+          <w:tcPr/>
+          <w:p>
+            <w:pPr>
+              <w:pStyle w:val="Compact"/>
+              <w:jc w:val="left"/>
+            </w:pPr>
+            <w:r>
+              <w:rPr>
+                <w:b/>
+                <w:bCs/>
+              </w:rPr>
+              <w:t xml:space="preserve">10. Peer review of search strategy</w:t>
+            </w:r>
+          </w:p>
+        </w:tc>
+        <w:tc>
+          <w:tcPr/>
+          <w:p>
+            <w:pPr>
+              <w:pStyle w:val="Compact"/>
+              <w:jc w:val="left"/>
+            </w:pPr>
+            <w:r>
+              <w:t xml:space="preserve">Indicate if the search strategy was peer-reviewed by an expert (e.g., librarian or PRESS).</w:t>
+            </w:r>
+          </w:p>
+        </w:tc>
+        <w:tc>
+          <w:tcPr/>
+          <w:p>
+            <w:pPr>
+              <w:pStyle w:val="Compact"/>
+              <w:jc w:val="left"/>
+            </w:pPr>
+            <w:r>
+              <w:t xml:space="preserve">Search strategy developed in collaboration with a medical librarian and algorithmically optimized via term co-occurrence networks in R.</w:t>
+            </w:r>
+          </w:p>
+        </w:tc>
+        <w:tc>
+          <w:tcPr/>
+          <w:p>
+            <w:pPr>
+              <w:pStyle w:val="Compact"/>
+              <w:jc w:val="left"/>
+            </w:pPr>
+            <w:r>
+              <w:t xml:space="preserve">Section 3.1 &amp; Section 3.2</w:t>
+            </w:r>
+          </w:p>
+        </w:tc>
+      </w:tr>
+      <w:tr>
+        <w:tc>
+          <w:tcPr/>
+          <w:p>
+            <w:pPr>
+              <w:pStyle w:val="Compact"/>
+              <w:jc w:val="left"/>
+            </w:pPr>
+            <w:r>
+              <w:rPr>
+                <w:b/>
+                <w:bCs/>
+              </w:rPr>
+              <w:t xml:space="preserve">11. Total records identified</w:t>
+            </w:r>
+          </w:p>
+        </w:tc>
+        <w:tc>
+          <w:tcPr/>
+          <w:p>
+            <w:pPr>
+              <w:pStyle w:val="Compact"/>
+              <w:jc w:val="left"/>
+            </w:pPr>
+            <w:r>
+              <w:t xml:space="preserve">Report the total number of records identified from each database and grey literature source.</w:t>
+            </w:r>
+          </w:p>
+        </w:tc>
+        <w:tc>
+          <w:tcPr/>
+          <w:p>
+            <w:pPr>
+              <w:pStyle w:val="Compact"/>
+              <w:jc w:val="left"/>
+            </w:pPr>
+            <w:r>
+              <w:rPr>
+                <w:i/>
+                <w:iCs/>
+              </w:rPr>
+              <w:t xml:space="preserve">Pending empirical execution (September 2026)</w:t>
+            </w:r>
+            <w:r>
+              <w:t xml:space="preserve">. Will be formally documented in the final PRISMA-ScR flow diagram.</w:t>
+            </w:r>
+          </w:p>
+        </w:tc>
+        <w:tc>
+          <w:tcPr/>
+          <w:p>
+            <w:pPr>
+              <w:pStyle w:val="Compact"/>
+              <w:jc w:val="left"/>
+            </w:pPr>
+            <w:r>
+              <w:t xml:space="preserve">Flow Diagram / Results</w:t>
+            </w:r>
+          </w:p>
+        </w:tc>
+      </w:tr>
+      <w:tr>
+        <w:tc>
+          <w:tcPr/>
+          <w:p>
+            <w:pPr>
+              <w:pStyle w:val="Compact"/>
+              <w:jc w:val="left"/>
+            </w:pPr>
+            <w:r>
+              <w:rPr>
+                <w:b/>
+                <w:bCs/>
+              </w:rPr>
+              <w:t xml:space="preserve">12. Duplicate removal</w:t>
+            </w:r>
+          </w:p>
+        </w:tc>
+        <w:tc>
+          <w:tcPr/>
+          <w:p>
+            <w:pPr>
+              <w:pStyle w:val="Compact"/>
+              <w:jc w:val="left"/>
+            </w:pPr>
+            <w:r>
+              <w:t xml:space="preserve">Describe the process and tools used for duplicate removal.</w:t>
+            </w:r>
+          </w:p>
+        </w:tc>
+        <w:tc>
+          <w:tcPr/>
+          <w:p>
+            <w:pPr>
+              <w:pStyle w:val="Compact"/>
+              <w:jc w:val="left"/>
+            </w:pPr>
+            <w:r>
+              <w:t xml:space="preserve">Automated consolidation using the</w:t>
+            </w:r>
+            <w:r>
+              <w:t xml:space="preserve"> </w:t>
+            </w:r>
+            <w:r>
+              <w:rPr>
+                <w:rStyle w:val="VerbatimChar"/>
+              </w:rPr>
+              <w:t xml:space="preserve">synthesisr</w:t>
+            </w:r>
+            <w:r>
+              <w:t xml:space="preserve"> </w:t>
+            </w:r>
+            <w:r>
+              <w:t xml:space="preserve">package in R via fuzzy string-matching, with manual verification of edge cases.</w:t>
+            </w:r>
+          </w:p>
+        </w:tc>
+        <w:tc>
+          <w:tcPr/>
+          <w:p>
+            <w:pPr>
+              <w:pStyle w:val="Compact"/>
+              <w:jc w:val="left"/>
+            </w:pPr>
+            <w:r>
+              <w:t xml:space="preserve">Section 3.2</w:t>
+            </w:r>
+          </w:p>
+        </w:tc>
+      </w:tr>
+      <w:tr>
+        <w:tc>
+          <w:tcPr/>
+          <w:p>
+            <w:pPr>
+              <w:pStyle w:val="Compact"/>
+              <w:jc w:val="left"/>
+            </w:pPr>
+            <w:r>
+              <w:rPr>
+                <w:b/>
+                <w:bCs/>
+              </w:rPr>
+              <w:t xml:space="preserve">13. Selection process</w:t>
+            </w:r>
+          </w:p>
+        </w:tc>
+        <w:tc>
+          <w:tcPr/>
+          <w:p>
+            <w:pPr>
+              <w:pStyle w:val="Compact"/>
+              <w:jc w:val="left"/>
+            </w:pPr>
+            <w:r>
+              <w:t xml:space="preserve">Describe the study selection and screening process (title/abstract and full-text screening).</w:t>
+            </w:r>
+          </w:p>
+        </w:tc>
+        <w:tc>
+          <w:tcPr/>
+          <w:p>
+            <w:pPr>
+              <w:pStyle w:val="Compact"/>
+              <w:jc w:val="left"/>
+            </w:pPr>
+            <w:r>
+              <w:t xml:space="preserve">Dual independent screening by two human reviewers via</w:t>
+            </w:r>
+            <w:r>
+              <w:t xml:space="preserve"> </w:t>
+            </w:r>
+            <w:r>
+              <w:rPr>
+                <w:rStyle w:val="VerbatimChar"/>
+              </w:rPr>
+              <w:t xml:space="preserve">revtools</w:t>
+            </w:r>
+            <w:r>
+              <w:t xml:space="preserve">, assisted by Latent Dirichlet Allocation (LDA) topic modeling strictly as a human-in-the-loop decision-support tool.</w:t>
+            </w:r>
+          </w:p>
+        </w:tc>
+        <w:tc>
+          <w:tcPr/>
+          <w:p>
+            <w:pPr>
+              <w:pStyle w:val="Compact"/>
+              <w:jc w:val="left"/>
+            </w:pPr>
+            <w:r>
+              <w:t xml:space="preserve">Section 3.2</w:t>
+            </w:r>
+          </w:p>
+        </w:tc>
+      </w:tr>
+      <w:tr>
+        <w:tc>
+          <w:tcPr/>
+          <w:p>
+            <w:pPr>
+              <w:pStyle w:val="Compact"/>
+              <w:jc w:val="left"/>
+            </w:pPr>
+            <w:r>
+              <w:rPr>
+                <w:b/>
+                <w:bCs/>
+              </w:rPr>
+              <w:t xml:space="preserve">14. Data collection process</w:t>
+            </w:r>
+          </w:p>
+        </w:tc>
+        <w:tc>
+          <w:tcPr/>
+          <w:p>
+            <w:pPr>
+              <w:pStyle w:val="Compact"/>
+              <w:jc w:val="left"/>
+            </w:pPr>
+            <w:r>
+              <w:t xml:space="preserve">Describe the data collection process and extraction tools.</w:t>
+            </w:r>
+          </w:p>
+        </w:tc>
+        <w:tc>
+          <w:tcPr/>
+          <w:p>
+            <w:pPr>
+              <w:pStyle w:val="Compact"/>
+              <w:jc w:val="left"/>
+            </w:pPr>
+            <w:r>
+              <w:t xml:space="preserve">Standardized programmatic data charting in R across six analytical dimensions, executed independently and in duplicate.</w:t>
+            </w:r>
+          </w:p>
+        </w:tc>
+        <w:tc>
+          <w:tcPr/>
+          <w:p>
+            <w:pPr>
+              <w:pStyle w:val="Compact"/>
+              <w:jc w:val="left"/>
+            </w:pPr>
+            <w:r>
+              <w:t xml:space="preserve">Section 3.3</w:t>
+            </w:r>
+          </w:p>
+        </w:tc>
+      </w:tr>
+      <w:tr>
+        <w:tc>
+          <w:tcPr/>
+          <w:p>
+            <w:pPr>
+              <w:pStyle w:val="Compact"/>
+              <w:jc w:val="left"/>
+            </w:pPr>
+            <w:r>
+              <w:rPr>
+                <w:b/>
+                <w:bCs/>
+              </w:rPr>
+              <w:t xml:space="preserve">15. Data items</w:t>
+            </w:r>
+          </w:p>
+        </w:tc>
+        <w:tc>
+          <w:tcPr/>
+          <w:p>
+            <w:pPr>
+              <w:pStyle w:val="Compact"/>
+              <w:jc w:val="left"/>
+            </w:pPr>
+            <w:r>
+              <w:t xml:space="preserve">List and define all variables planned for extraction.</w:t>
+            </w:r>
+          </w:p>
+        </w:tc>
+        <w:tc>
+          <w:tcPr/>
+          <w:p>
+            <w:pPr>
+              <w:pStyle w:val="Compact"/>
+              <w:jc w:val="left"/>
+            </w:pPr>
+            <w:r>
+              <w:t xml:space="preserve">Electronic data charting form structured across 6 blocks: Metadata, Health System Context, Registry Characteristics, Garbage Code Typology, Correction Methodology, and Microsimulation Applicability.</w:t>
+            </w:r>
+          </w:p>
+        </w:tc>
+        <w:tc>
+          <w:tcPr/>
+          <w:p>
+            <w:pPr>
+              <w:pStyle w:val="Compact"/>
+              <w:jc w:val="left"/>
+            </w:pPr>
+            <w:r>
+              <w:t xml:space="preserve">Section 6.2 (Appendix II)</w:t>
+            </w:r>
+          </w:p>
+        </w:tc>
+      </w:tr>
+      <w:tr>
+        <w:tc>
+          <w:tcPr/>
+          <w:p>
+            <w:pPr>
+              <w:pStyle w:val="Compact"/>
+              <w:jc w:val="left"/>
+            </w:pPr>
+            <w:r>
+              <w:rPr>
+                <w:b/>
+                <w:bCs/>
+              </w:rPr>
+              <w:t xml:space="preserve">16. Search auditability &amp; reproducibility</w:t>
+            </w:r>
+          </w:p>
+        </w:tc>
+        <w:tc>
+          <w:tcPr/>
+          <w:p>
+            <w:pPr>
+              <w:pStyle w:val="Compact"/>
+              <w:jc w:val="left"/>
+            </w:pPr>
+            <w:r>
+              <w:t xml:space="preserve">Ensure complete audit trail and reproducibility of the search process.</w:t>
+            </w:r>
+          </w:p>
+        </w:tc>
+        <w:tc>
+          <w:tcPr/>
+          <w:p>
+            <w:pPr>
+              <w:pStyle w:val="Compact"/>
+              <w:jc w:val="left"/>
+            </w:pPr>
+            <w:r>
+              <w:t xml:space="preserve">Executable R scripts, syntax codes, and extraction matrices exported and permanently archived in the project’s OSF repository.</w:t>
+            </w:r>
+          </w:p>
+        </w:tc>
+        <w:tc>
+          <w:tcPr/>
+          <w:p>
+            <w:pPr>
+              <w:pStyle w:val="Compact"/>
+              <w:jc w:val="left"/>
+            </w:pPr>
+            <w:r>
+              <w:t xml:space="preserve">Section 3.2 &amp; Section 3.3</w:t>
+            </w:r>
+          </w:p>
+        </w:tc>
+      </w:tr>
+    </w:tbl>
+    <w:bookmarkEnd w:id="108"/>
+    <w:bookmarkEnd w:id="109"/>
     <w:sectPr>
       <w:headerReference r:id="rId6" w:type="even"/>
       <w:headerReference r:id="rId7" w:type="default"/>
@@ -5911,6 +7352,12 @@
     <w:abstractNumId w:val="991"/>
   </w:num>
   <w:num w:numId="1017">
+    <w:abstractNumId w:val="991"/>
+  </w:num>
+  <w:num w:numId="1018">
+    <w:abstractNumId w:val="991"/>
+  </w:num>
+  <w:num w:numId="1019">
     <w:abstractNumId w:val="991"/>
   </w:num>
 </w:numbering>

</xml_diff>